<commit_message>
Update to the final report
</commit_message>
<xml_diff>
--- a/project_reports/ProgressReport/Riveraruiz0608_FinalProject.docx
+++ b/project_reports/ProgressReport/Riveraruiz0608_FinalProject.docx
@@ -402,7 +402,47 @@
           <w:color w:val="000000" w:themeColor="text1"/>
           <w:sz w:val="22"/>
         </w:rPr>
-        <w:t>The optimized Lasso backbone achieved test R-squared of approximately 0.9092 and RMSE of approximately 0.4531 on a temporally held-out test set, exceeding the project success threshold of out-of-sample R-squared greater than 0.85.</w:t>
+        <w:t xml:space="preserve">The optimized Lasso backbone achieved test R-squared of approximately 0.9092 and </w:t>
+      </w:r>
+      <w:r>
+        <w:rPr>
+          <w:rFonts w:ascii="Times New Roman" w:hAnsi="Times New Roman" w:cs="Times New Roman"/>
+          <w:color w:val="000000" w:themeColor="text1"/>
+          <w:sz w:val="22"/>
+        </w:rPr>
+        <w:t>Root Mean Squared Error</w:t>
+      </w:r>
+      <w:r>
+        <w:rPr>
+          <w:rFonts w:ascii="Times New Roman" w:hAnsi="Times New Roman" w:cs="Times New Roman"/>
+          <w:color w:val="000000" w:themeColor="text1"/>
+          <w:sz w:val="22"/>
+        </w:rPr>
+        <w:t xml:space="preserve"> (</w:t>
+      </w:r>
+      <w:r>
+        <w:rPr>
+          <w:rFonts w:ascii="Times New Roman" w:hAnsi="Times New Roman" w:cs="Times New Roman"/>
+          <w:color w:val="000000" w:themeColor="text1"/>
+          <w:sz w:val="22"/>
+        </w:rPr>
+        <w:t>RMSE</w:t>
+      </w:r>
+      <w:r>
+        <w:rPr>
+          <w:rFonts w:ascii="Times New Roman" w:hAnsi="Times New Roman" w:cs="Times New Roman"/>
+          <w:color w:val="000000" w:themeColor="text1"/>
+          <w:sz w:val="22"/>
+        </w:rPr>
+        <w:t>)</w:t>
+      </w:r>
+      <w:r>
+        <w:rPr>
+          <w:rFonts w:ascii="Times New Roman" w:hAnsi="Times New Roman" w:cs="Times New Roman"/>
+          <w:color w:val="000000" w:themeColor="text1"/>
+          <w:sz w:val="22"/>
+        </w:rPr>
+        <w:t xml:space="preserve"> of approximately 0.4531 on a temporally held-out test set, exceeding the project success threshold of out-of-sample R-squared greater than 0.85.</w:t>
       </w:r>
     </w:p>
     <w:p>
@@ -927,7 +967,47 @@
           <w:color w:val="000000" w:themeColor="text1"/>
           <w:sz w:val="22"/>
         </w:rPr>
-        <w:t>, and each row combines population history, economic indicators, vital-rate context, vulnerability measures, public-safety indicators, disaster exposure, regional labels, and engineered lag or rolling features. This format allows the model to learn both cross-sectional differences between municipalities and temporal persistence within each municipality.</w:t>
+        <w:t xml:space="preserve">, </w:t>
+      </w:r>
+      <w:r>
+        <w:rPr>
+          <w:rFonts w:ascii="Times New Roman" w:hAnsi="Times New Roman" w:cs="Times New Roman"/>
+          <w:color w:val="000000" w:themeColor="text1"/>
+          <w:sz w:val="22"/>
+        </w:rPr>
+        <w:t>and</w:t>
+      </w:r>
+      <w:r>
+        <w:rPr>
+          <w:rFonts w:ascii="Times New Roman" w:hAnsi="Times New Roman" w:cs="Times New Roman"/>
+          <w:color w:val="000000" w:themeColor="text1"/>
+          <w:sz w:val="22"/>
+        </w:rPr>
+        <w:t xml:space="preserve"> combines population history, economic indicators, vital-rate context, vulnerability measures, public-safety indicators, disaster exposure, regional labels, and engineered lag or rolling features. This format allows the model to learn both </w:t>
+      </w:r>
+      <w:r>
+        <w:rPr>
+          <w:rFonts w:ascii="Times New Roman" w:hAnsi="Times New Roman" w:cs="Times New Roman"/>
+          <w:color w:val="000000" w:themeColor="text1"/>
+          <w:sz w:val="22"/>
+        </w:rPr>
+        <w:t>cross</w:t>
+      </w:r>
+      <w:r>
+        <w:rPr>
+          <w:rFonts w:ascii="Times New Roman" w:hAnsi="Times New Roman" w:cs="Times New Roman"/>
+          <w:color w:val="000000" w:themeColor="text1"/>
+          <w:sz w:val="22"/>
+        </w:rPr>
+        <w:t>-sectional</w:t>
+      </w:r>
+      <w:r>
+        <w:rPr>
+          <w:rFonts w:ascii="Times New Roman" w:hAnsi="Times New Roman" w:cs="Times New Roman"/>
+          <w:color w:val="000000" w:themeColor="text1"/>
+          <w:sz w:val="22"/>
+        </w:rPr>
+        <w:t xml:space="preserve"> differences between municipalities and temporal persistence within each municipality.</w:t>
       </w:r>
     </w:p>
     <w:p>
@@ -986,7 +1066,7 @@
           <w:color w:val="000000" w:themeColor="text1"/>
           <w:sz w:val="22"/>
         </w:rPr>
-        <w:t>Socio-economic data: American Community Survey indicators such as income, employment, and related municipal-level conditions.</w:t>
+        <w:t>Disaster exposure: hurricane wind exposure, earthquake exposure, rolling disaster measures, and interactions with vulnerability-related features.</w:t>
       </w:r>
     </w:p>
     <w:p>
@@ -1005,7 +1085,7 @@
           <w:color w:val="000000" w:themeColor="text1"/>
           <w:sz w:val="22"/>
         </w:rPr>
-        <w:t>Business activity: establishment growth and related indicators used to represent local economic vitality.</w:t>
+        <w:t>Socio-economic data: American Community Survey indicators such as income, employment, and related municipal-level conditions.</w:t>
       </w:r>
     </w:p>
     <w:p>
@@ -1024,7 +1104,7 @@
           <w:color w:val="000000" w:themeColor="text1"/>
           <w:sz w:val="22"/>
         </w:rPr>
-        <w:t>Vital statistics: islandwide and municipal demographic context, including births, deaths, and natural-change rates when available.</w:t>
+        <w:t>Public safety: crime-rate and public-safety variables, with interpolation or regional weighting applied where reporting gaps required careful handling.</w:t>
       </w:r>
     </w:p>
     <w:p>
@@ -1043,7 +1123,7 @@
           <w:color w:val="000000" w:themeColor="text1"/>
           <w:sz w:val="22"/>
         </w:rPr>
-        <w:t>Public safety: crime-rate and public-safety variables, with interpolation or regional weighting applied where reporting gaps required careful handling.</w:t>
+        <w:t>Business activity: establishment growth and related indicators used to represent local economic vitality.</w:t>
       </w:r>
     </w:p>
     <w:p>
@@ -1062,7 +1142,7 @@
           <w:color w:val="000000" w:themeColor="text1"/>
           <w:sz w:val="22"/>
         </w:rPr>
-        <w:t>Disaster exposure: hurricane wind exposure, earthquake exposure, rolling disaster measures, and interactions with vulnerability-related features.</w:t>
+        <w:t>Vital statistics: islandwide and municipal demographic context, including births, deaths, and natural-change rates when available.</w:t>
       </w:r>
     </w:p>
     <w:p>
@@ -1120,7 +1200,23 @@
           <w:color w:val="000000" w:themeColor="text1"/>
           <w:sz w:val="22"/>
         </w:rPr>
-        <w:t>The core target is municipal population change expressed as a forward-looking percentage outcome. The final modeling approach emphasizes a 3-year forward target because population movement is rarely instantaneous. Migration, natural change, and economic adjustment often unfold over multiple years, especially after disasters. A forward target also helps the model capture longer-run demographic pressure rather than reacting only to year-to-year noise.</w:t>
+        <w:t xml:space="preserve">The core target is population change expressed as a forward-looking percentage outcome. The final modeling approach emphasizes a 3-year forward target because population movement is rarely instantaneous. Migration, natural change, and economic adjustment often unfold over multiple years, especially after </w:t>
+      </w:r>
+      <w:r>
+        <w:rPr>
+          <w:rFonts w:ascii="Times New Roman" w:hAnsi="Times New Roman" w:cs="Times New Roman"/>
+          <w:color w:val="000000" w:themeColor="text1"/>
+          <w:sz w:val="22"/>
+        </w:rPr>
+        <w:t xml:space="preserve">natural </w:t>
+      </w:r>
+      <w:r>
+        <w:rPr>
+          <w:rFonts w:ascii="Times New Roman" w:hAnsi="Times New Roman" w:cs="Times New Roman"/>
+          <w:color w:val="000000" w:themeColor="text1"/>
+          <w:sz w:val="22"/>
+        </w:rPr>
+        <w:t>disasters. A forward target also helps the model capture longer-run demographic pressure rather than reacting only to year-to-year noise.</w:t>
       </w:r>
     </w:p>
     <w:p>
@@ -1178,7 +1274,7 @@
           <w:color w:val="000000" w:themeColor="text1"/>
           <w:sz w:val="22"/>
         </w:rPr>
-        <w:t>The data integration phase required aligning sources with different reporting frequencies, geographic structures, and missingness patterns. Crime and public-safety data contained gaps caused by reporting shifts. These gaps were handled conservatively through interpolation and regional weighting so that missing values did not create artificial jumps. Economic and ACS-derived variables were treated cautiously because smaller municipalities can have higher sampling uncertainty and margins of error.</w:t>
+        <w:t>The project intentionally focuses on the modern demographic era rather than the full historical record. Earlier decades may reflect different structural regimes, while the post-2010 period captures fiscal stress, natural population decrease, post-Maria disruption, and more recent recovery dynamics. This focus improves relevance for forecasting and policy analysis, but it also means the model is calibrated to a specific historical period rather than all possible demographic regimes.</w:t>
       </w:r>
     </w:p>
     <w:p>
@@ -1196,7 +1292,25 @@
           <w:color w:val="000000" w:themeColor="text1"/>
           <w:sz w:val="22"/>
         </w:rPr>
-        <w:t>The project intentionally focuses on the modern demographic era rather than the full historical record. Earlier decades may reflect different structural regimes, while the post-2010 period captures fiscal stress, natural population decrease, post-Maria disruption, and more recent recovery dynamics. This focus improves relevance for forecasting and policy analysis, but it also means the model is calibrated to a specific historical period rather than all possible demographic regimes.</w:t>
+        <w:t xml:space="preserve">The data integration process required combining multiple source files that did not share the same structure, time coverage, or reporting format. Population, income, employment, business establishment, public safety, vital-rate, hurricane, earthquake, and social vulnerability data had to be standardized into a common local-year panel before they could support regional and islandwide forecasting. This required harmonizing municipality names, aligning annual records, converting inconsistent numeric fields, checking feature availability, and documenting missingness across the final dataset. Public-safety and some economic indicators required </w:t>
+      </w:r>
+      <w:proofErr w:type="gramStart"/>
+      <w:r>
+        <w:rPr>
+          <w:rFonts w:ascii="Times New Roman" w:hAnsi="Times New Roman" w:cs="Times New Roman"/>
+          <w:color w:val="000000" w:themeColor="text1"/>
+          <w:sz w:val="22"/>
+        </w:rPr>
+        <w:t>particular caution</w:t>
+      </w:r>
+      <w:proofErr w:type="gramEnd"/>
+      <w:r>
+        <w:rPr>
+          <w:rFonts w:ascii="Times New Roman" w:hAnsi="Times New Roman" w:cs="Times New Roman"/>
+          <w:color w:val="000000" w:themeColor="text1"/>
+          <w:sz w:val="22"/>
+        </w:rPr>
+        <w:t xml:space="preserve"> because reporting practices and source coverage vary across years. Rather than allowing these inconsistencies to create artificial spikes or gaps, the notebook applies conservative cleaning and quality checks so that the final modeling dataset reflects meaningful demographic and structural patterns instead of source-format noise.</w:t>
       </w:r>
     </w:p>
     <w:p>
@@ -1466,7 +1580,32 @@
           <w:color w:val="000000" w:themeColor="text1"/>
           <w:sz w:val="22"/>
         </w:rPr>
-        <w:t>The EDA visualizations support the conclusion that vulnerability and demographic momentum are spatially uneven. Social vulnerability maps highlight that risk is not uniform across Puerto Rico. The southern coast and central mountainous municipalities face different combinations of hazard exposure, infrastructure fragility, and demographic pressure. Vital-rate charts show that population change is not only a migration issue; a shift toward natural decrease means that births and deaths must be treated separately from migration-driven population movement.</w:t>
+        <w:t xml:space="preserve">The EDA visualizations support the conclusion that vulnerability and demographic momentum are spatially uneven. Social vulnerability maps highlight that risk is not uniform across Puerto Rico. The southern coast and central mountainous municipalities face different combinations of hazard exposure, infrastructure fragility, and </w:t>
+      </w:r>
+      <w:r>
+        <w:rPr>
+          <w:rFonts w:ascii="Times New Roman" w:hAnsi="Times New Roman" w:cs="Times New Roman"/>
+          <w:color w:val="000000" w:themeColor="text1"/>
+          <w:sz w:val="22"/>
+        </w:rPr>
+        <w:lastRenderedPageBreak/>
+        <w:t>demographic pressure. Vital</w:t>
+      </w:r>
+      <w:r>
+        <w:rPr>
+          <w:rFonts w:ascii="Times New Roman" w:hAnsi="Times New Roman" w:cs="Times New Roman"/>
+          <w:color w:val="000000" w:themeColor="text1"/>
+          <w:sz w:val="22"/>
+        </w:rPr>
+        <w:t xml:space="preserve"> </w:t>
+      </w:r>
+      <w:r>
+        <w:rPr>
+          <w:rFonts w:ascii="Times New Roman" w:hAnsi="Times New Roman" w:cs="Times New Roman"/>
+          <w:color w:val="000000" w:themeColor="text1"/>
+          <w:sz w:val="22"/>
+        </w:rPr>
+        <w:t>rate charts show that population change is not only a migration issue; a shift toward natural decrease means that births and deaths must be treated separately from migration-driven population movement.</w:t>
       </w:r>
     </w:p>
     <w:p>
@@ -1484,7 +1623,6 @@
           <w:color w:val="000000" w:themeColor="text1"/>
           <w:sz w:val="22"/>
         </w:rPr>
-        <w:lastRenderedPageBreak/>
         <w:t>This phase shaped the modeling strategy. Because the strongest signals were temporal and structural, the final model needed engineered lag and rolling variables. Because disaster relationships were indirect, disaster scenarios were later modeled as stress tests through the engineered feature space rather than as simple one-year causal shocks.</w:t>
       </w:r>
     </w:p>
@@ -1751,6 +1889,7 @@
           <w:sz w:val="22"/>
           <w:szCs w:val="22"/>
         </w:rPr>
+        <w:lastRenderedPageBreak/>
         <w:t>4.3 Evaluation Metrics</w:t>
       </w:r>
     </w:p>
@@ -1790,7 +1929,6 @@
           <w:sz w:val="22"/>
           <w:szCs w:val="22"/>
         </w:rPr>
-        <w:lastRenderedPageBreak/>
         <w:t>4.4 Model Comparison and Iteration</w:t>
       </w:r>
     </w:p>
@@ -2383,7 +2521,7 @@
           <w:color w:val="000000" w:themeColor="text1"/>
           <w:sz w:val="22"/>
         </w:rPr>
-        <w:t>Final selected model: tuned Lasso regression.</w:t>
+        <w:t>Final selected model: Lasso regression.</w:t>
       </w:r>
     </w:p>
     <w:p>
@@ -2547,16 +2685,6 @@
           <w:sz w:val="22"/>
         </w:rPr>
       </w:pPr>
-    </w:p>
-    <w:p>
-      <w:pPr>
-        <w:spacing w:after="120" w:line="259" w:lineRule="auto"/>
-        <w:rPr>
-          <w:rFonts w:ascii="Times New Roman" w:hAnsi="Times New Roman" w:cs="Times New Roman"/>
-          <w:color w:val="000000" w:themeColor="text1"/>
-          <w:sz w:val="22"/>
-        </w:rPr>
-      </w:pPr>
       <w:r>
         <w:rPr>
           <w:rFonts w:ascii="Times New Roman" w:hAnsi="Times New Roman" w:cs="Times New Roman"/>
@@ -2629,6 +2757,10 @@
     <w:p>
       <w:pPr>
         <w:pStyle w:val="ListNumber"/>
+        <w:numPr>
+          <w:ilvl w:val="0"/>
+          <w:numId w:val="11"/>
+        </w:numPr>
         <w:spacing w:after="60"/>
         <w:rPr>
           <w:rFonts w:ascii="Times New Roman" w:hAnsi="Times New Roman" w:cs="Times New Roman"/>
@@ -2642,6 +2774,7 @@
           <w:color w:val="000000" w:themeColor="text1"/>
           <w:sz w:val="22"/>
         </w:rPr>
+        <w:lastRenderedPageBreak/>
         <w:t>Natural-change and lagged population conditions are the strongest signals. Municipalities already experiencing sustained decline or a negative birth-death balance are harder to stabilize without substantial migration or structural change.</w:t>
       </w:r>
     </w:p>
@@ -2661,7 +2794,6 @@
           <w:color w:val="000000" w:themeColor="text1"/>
           <w:sz w:val="22"/>
         </w:rPr>
-        <w:lastRenderedPageBreak/>
         <w:t>Social vulnerability acts as a multiplier. High vulnerability can intensify the population consequences of shocks because recovery capacity, infrastructure resilience, and household resources are unevenly distributed.</w:t>
       </w:r>
     </w:p>
@@ -2799,7 +2931,23 @@
           <w:color w:val="000000" w:themeColor="text1"/>
           <w:sz w:val="22"/>
         </w:rPr>
-        <w:t>The Forecasting, Scenario Simulation, and Model Validation stage carries forward the validated Lasso model from the Predictive Modeling and Temporal Validation stage into a multi-scale scenario forecasting framework. The same forecasting backbone is used throughout the analysis to preserve methodological continuity. Scenario conditions are applied through the engineered feature space, and outputs are summarized at local, regional, and islandwide levels through 2030.</w:t>
+        <w:t>The Forecasting, Scenario Simulation, and Model Validation stage carries forward the validated Lasso model from the Predictive Modeling and Temporal Validation stage into a multi-scale scenario forecasting framework. The same forecasting backbone is used throughout the analysis to preserve methodological continuity. Scenario conditions are applied through the engineered feature space, and outputs are summarized at regional</w:t>
+      </w:r>
+      <w:r>
+        <w:rPr>
+          <w:rFonts w:ascii="Times New Roman" w:hAnsi="Times New Roman" w:cs="Times New Roman"/>
+          <w:color w:val="000000" w:themeColor="text1"/>
+          <w:sz w:val="22"/>
+        </w:rPr>
+        <w:t xml:space="preserve"> </w:t>
+      </w:r>
+      <w:r>
+        <w:rPr>
+          <w:rFonts w:ascii="Times New Roman" w:hAnsi="Times New Roman" w:cs="Times New Roman"/>
+          <w:color w:val="000000" w:themeColor="text1"/>
+          <w:sz w:val="22"/>
+        </w:rPr>
+        <w:t>and islandwide levels through 2030.</w:t>
       </w:r>
     </w:p>
     <w:p>
@@ -2874,7 +3022,72 @@
           <w:color w:val="000000" w:themeColor="text1"/>
           <w:sz w:val="22"/>
         </w:rPr>
-        <w:t xml:space="preserve">Scenario results show that severe hurricane scenarios generate the largest long-run population losses relative to baseline. Earthquake scenarios also reduce projected population, although high-magnitude earthquake cases can converge at the aggregate level because the stylized overlay has a practical ceiling. The Maria-like </w:t>
+        <w:t>The scenario results show that stronger disaster assumptions produce larger projected population losses relative to the baseline forecast. Figure 3 presents the islandwide forecast paths for both the hurricane and earthquake scenario ladders. In both panels, the observed population series shows a long-running decline before the forecast period begins, and the post-forecast scenario lines continue that downward trajectory under different shock assumptions. The hurricane ladder shows the clearest separation between scenarios, with the most severe Maria-like Category 5 case producing the steepest projected decline by 2030. The earthquake ladder also reduces projected population relative to baseline, but the highest-magnitude earthquake cases are closer together, suggesting that the stylized earthquake overlay reaches a practical ceiling at the islandwide scale.</w:t>
+      </w:r>
+    </w:p>
+    <w:p>
+      <w:pPr>
+        <w:spacing w:after="120" w:line="259" w:lineRule="auto"/>
+        <w:rPr>
+          <w:rFonts w:ascii="Times New Roman" w:hAnsi="Times New Roman" w:cs="Times New Roman"/>
+          <w:color w:val="000000" w:themeColor="text1"/>
+          <w:sz w:val="22"/>
+        </w:rPr>
+      </w:pPr>
+      <w:r>
+        <w:rPr>
+          <w:rFonts w:ascii="Times New Roman" w:hAnsi="Times New Roman" w:cs="Times New Roman"/>
+          <w:color w:val="000000" w:themeColor="text1"/>
+          <w:sz w:val="22"/>
+        </w:rPr>
+        <w:t xml:space="preserve">Figure 4 adds the regional dimension by showing how 2030 impacts differ across Puerto Rico under selected hurricane and earthquake scenarios. These maps show that scenario impacts are spatially uneven rather than uniform across the island. Severe hurricane conditions produce larger regional losses than moderate hurricane conditions, and the Maria-like scenario creates the strongest regional impacts. Earthquake scenarios also generate losses, but their effects vary by region and do not follow </w:t>
+      </w:r>
+      <w:proofErr w:type="gramStart"/>
+      <w:r>
+        <w:rPr>
+          <w:rFonts w:ascii="Times New Roman" w:hAnsi="Times New Roman" w:cs="Times New Roman"/>
+          <w:color w:val="000000" w:themeColor="text1"/>
+          <w:sz w:val="22"/>
+        </w:rPr>
+        <w:t>exactly the same</w:t>
+      </w:r>
+      <w:proofErr w:type="gramEnd"/>
+      <w:r>
+        <w:rPr>
+          <w:rFonts w:ascii="Times New Roman" w:hAnsi="Times New Roman" w:cs="Times New Roman"/>
+          <w:color w:val="000000" w:themeColor="text1"/>
+          <w:sz w:val="22"/>
+        </w:rPr>
+        <w:t xml:space="preserve"> pattern as hurricane impacts. Together, Figures 3 and 4 support the interpretation that disasters amplify existing population decline trajectories, while the size and location of those impacts depend on the type and severity of the shock.</w:t>
+      </w:r>
+    </w:p>
+    <w:p>
+      <w:pPr>
+        <w:spacing w:after="120" w:line="259" w:lineRule="auto"/>
+        <w:rPr>
+          <w:rFonts w:ascii="Times New Roman" w:hAnsi="Times New Roman" w:cs="Times New Roman"/>
+          <w:color w:val="000000" w:themeColor="text1"/>
+          <w:sz w:val="22"/>
+        </w:rPr>
+      </w:pPr>
+    </w:p>
+    <w:p>
+      <w:pPr>
+        <w:spacing w:after="120" w:line="259" w:lineRule="auto"/>
+        <w:rPr>
+          <w:rFonts w:ascii="Times New Roman" w:hAnsi="Times New Roman" w:cs="Times New Roman"/>
+          <w:color w:val="000000" w:themeColor="text1"/>
+          <w:sz w:val="22"/>
+        </w:rPr>
+      </w:pPr>
+      <w:r>
+        <w:rPr>
+          <w:rFonts w:ascii="Times New Roman" w:hAnsi="Times New Roman" w:cs="Times New Roman"/>
+          <w:color w:val="000000" w:themeColor="text1"/>
+          <w:sz w:val="22"/>
+        </w:rPr>
+        <w:lastRenderedPageBreak/>
+        <w:t xml:space="preserve">The Maria-like </w:t>
       </w:r>
       <w:proofErr w:type="spellStart"/>
       <w:r>
@@ -2892,7 +3105,7 @@
           <w:color w:val="000000" w:themeColor="text1"/>
           <w:sz w:val="22"/>
         </w:rPr>
-        <w:t xml:space="preserve"> captures the direction of post-disaster decline but tends to overestimate long-run population loss, suggesting that the scenario module should be interpreted as a stress-testing framework rather than a precise causal forecasting model.</w:t>
+        <w:t xml:space="preserve"> captures the direction of post-disaster decline, but it tends to overestimate long-run population loss. For that reason, the scenario module should be interpreted as a structured stress-testing framework rather than a precise causal disaster-impact model. Its purpose is to compare how the validated forecasting model responds under different disaster assumptions, not to claim that any single scenario will exactly predict future population outcomes.</w:t>
       </w:r>
     </w:p>
     <w:p>
@@ -3679,7 +3892,86 @@
           <w:color w:val="000000" w:themeColor="text1"/>
           <w:sz w:val="22"/>
         </w:rPr>
-        <w:t>The scenario results strengthen the central interpretation of the project: disasters amplify existing population trends rather than creating demographic decline from scratch. Municipalities already facing vulnerability, aging, weak economic conditions, or negative demographic momentum are more likely to experience deeper or more persistent losses after shocks. This is why disaster resilience and demographic policy cannot be separated in practice.</w:t>
+        <w:t xml:space="preserve">The scenario results strengthen the central interpretation of the project: disasters amplify existing population trends rather than creating demographic decline from scratch. The islandwide forecast paths show that baseline decline is already present before disaster shocks are introduced, while the hurricane and earthquake scenario ladders push those existing trajectories downward at different intensities. This means that disasters should be </w:t>
+      </w:r>
+      <w:r>
+        <w:rPr>
+          <w:rFonts w:ascii="Times New Roman" w:hAnsi="Times New Roman" w:cs="Times New Roman"/>
+          <w:color w:val="000000" w:themeColor="text1"/>
+          <w:sz w:val="22"/>
+        </w:rPr>
+        <w:lastRenderedPageBreak/>
+        <w:t>interpreted as accelerants within an already fragile demographic system, not as isolated events that fully explain Puerto Rico’s population losses on their own.</w:t>
+      </w:r>
+    </w:p>
+    <w:p>
+      <w:pPr>
+        <w:spacing w:after="120" w:line="259" w:lineRule="auto"/>
+        <w:rPr>
+          <w:rFonts w:ascii="Times New Roman" w:hAnsi="Times New Roman" w:cs="Times New Roman"/>
+          <w:color w:val="000000" w:themeColor="text1"/>
+          <w:sz w:val="22"/>
+        </w:rPr>
+      </w:pPr>
+      <w:r>
+        <w:rPr>
+          <w:rFonts w:ascii="Times New Roman" w:hAnsi="Times New Roman" w:cs="Times New Roman"/>
+          <w:color w:val="000000" w:themeColor="text1"/>
+          <w:sz w:val="22"/>
+        </w:rPr>
+        <w:t>The regional maps further show that disaster impacts are spatially uneven. Regions already facing greater vulnerability, aging population structures, weaker economic conditions, or negative demographic momentum are more likely to experience deeper or more persistent losses after shocks. In other words, the same disaster scenario does not affect all parts of Puerto Rico equally. The effect depends on the conditions already present before the shock, including local recovery capacity, structural vulnerability, and the strength or weakness of prior population trends.</w:t>
+      </w:r>
+    </w:p>
+    <w:p>
+      <w:pPr>
+        <w:spacing w:after="120" w:line="259" w:lineRule="auto"/>
+        <w:rPr>
+          <w:rFonts w:ascii="Times New Roman" w:hAnsi="Times New Roman" w:cs="Times New Roman"/>
+          <w:color w:val="000000" w:themeColor="text1"/>
+          <w:sz w:val="22"/>
+        </w:rPr>
+      </w:pPr>
+      <w:r>
+        <w:rPr>
+          <w:rFonts w:ascii="Times New Roman" w:hAnsi="Times New Roman" w:cs="Times New Roman"/>
+          <w:color w:val="000000" w:themeColor="text1"/>
+          <w:sz w:val="22"/>
+        </w:rPr>
+        <w:t>This interpretation is important for planning because it connects disaster resilience directly to demographic policy. If population decline is already persistent, then disaster recovery cannot focus only on rebuilding physical infrastructure after an event. Recovery planning also needs to address the underlying conditions that make population loss more likely to continue, such as limited employment opportunity, housing vulnerability, public-safety concerns, aging communities, and weak return</w:t>
+      </w:r>
+      <w:r>
+        <w:rPr>
+          <w:rFonts w:ascii="Times New Roman" w:hAnsi="Times New Roman" w:cs="Times New Roman"/>
+          <w:color w:val="000000" w:themeColor="text1"/>
+          <w:sz w:val="22"/>
+        </w:rPr>
+        <w:t xml:space="preserve"> </w:t>
+      </w:r>
+      <w:r>
+        <w:rPr>
+          <w:rFonts w:ascii="Times New Roman" w:hAnsi="Times New Roman" w:cs="Times New Roman"/>
+          <w:color w:val="000000" w:themeColor="text1"/>
+          <w:sz w:val="22"/>
+        </w:rPr>
+        <w:t>migration incentives. The scenario results therefore suggest that long-term population stability requires both hazard preparedness and broader structural recovery strategies.</w:t>
+      </w:r>
+    </w:p>
+    <w:p>
+      <w:pPr>
+        <w:spacing w:after="120" w:line="259" w:lineRule="auto"/>
+        <w:rPr>
+          <w:rFonts w:ascii="Times New Roman" w:hAnsi="Times New Roman" w:cs="Times New Roman"/>
+          <w:color w:val="000000" w:themeColor="text1"/>
+          <w:sz w:val="22"/>
+        </w:rPr>
+      </w:pPr>
+      <w:r>
+        <w:rPr>
+          <w:rFonts w:ascii="Times New Roman" w:hAnsi="Times New Roman" w:cs="Times New Roman"/>
+          <w:color w:val="000000" w:themeColor="text1"/>
+          <w:sz w:val="22"/>
+        </w:rPr>
+        <w:t>Overall, the scenario analysis shows that Puerto Rico’s demographic future is shaped by the interaction between baseline population momentum and external shocks. Severe hurricanes and earthquakes can intensify decline, but the magnitude and persistence of that decline depend on pre-existing demographic and socioeconomic conditions. This reinforces the need to interpret the forecasts as stress tests: they are not exact predictions of a single future, but they help identify which regions and conditions may be most exposed to deeper population loss under future disaster scenarios.</w:t>
       </w:r>
     </w:p>
     <w:p>
@@ -3757,7 +4049,41 @@
           <w:color w:val="000000" w:themeColor="text1"/>
           <w:sz w:val="22"/>
         </w:rPr>
-        <w:t>The policy simulations are counterfactual stress tests. They show how the fitted model responds when local and regional conditions are improved under stylized policy packages. They do not prove that a real-world intervention would reproduce the modeled shift. This distinction is important because the model is trained on observational data and is designed for prediction, not causal identification.</w:t>
+        <w:t xml:space="preserve">The policy simulations are counterfactual stress tests. They show how the fitted model responds when local and regional conditions are improved under stylized policy packages. They do not prove that a </w:t>
+      </w:r>
+      <w:proofErr w:type="gramStart"/>
+      <w:r>
+        <w:rPr>
+          <w:rFonts w:ascii="Times New Roman" w:hAnsi="Times New Roman" w:cs="Times New Roman"/>
+          <w:color w:val="000000" w:themeColor="text1"/>
+          <w:sz w:val="22"/>
+        </w:rPr>
+        <w:t>real</w:t>
+      </w:r>
+      <w:r>
+        <w:rPr>
+          <w:rFonts w:ascii="Times New Roman" w:hAnsi="Times New Roman" w:cs="Times New Roman"/>
+          <w:color w:val="000000" w:themeColor="text1"/>
+          <w:sz w:val="22"/>
+        </w:rPr>
+        <w:t xml:space="preserve"> </w:t>
+      </w:r>
+      <w:r>
+        <w:rPr>
+          <w:rFonts w:ascii="Times New Roman" w:hAnsi="Times New Roman" w:cs="Times New Roman"/>
+          <w:color w:val="000000" w:themeColor="text1"/>
+          <w:sz w:val="22"/>
+        </w:rPr>
+        <w:t>world</w:t>
+      </w:r>
+      <w:proofErr w:type="gramEnd"/>
+      <w:r>
+        <w:rPr>
+          <w:rFonts w:ascii="Times New Roman" w:hAnsi="Times New Roman" w:cs="Times New Roman"/>
+          <w:color w:val="000000" w:themeColor="text1"/>
+          <w:sz w:val="22"/>
+        </w:rPr>
+        <w:t xml:space="preserve"> intervention would reproduce the modeled shift. This distinction is important because the model is trained on observational data and is designed for prediction, not causal identification.</w:t>
       </w:r>
     </w:p>
     <w:p>
@@ -3854,7 +4180,6 @@
           <w:color w:val="000000" w:themeColor="text1"/>
           <w:sz w:val="22"/>
         </w:rPr>
-        <w:lastRenderedPageBreak/>
         <w:t>Retention Bundle: combines economic, safety, vulnerability, and demographic-support improvements to test a coordinated population-retention strategy.</w:t>
       </w:r>
     </w:p>
@@ -3932,7 +4257,16 @@
           <w:color w:val="000000" w:themeColor="text1"/>
           <w:sz w:val="22"/>
         </w:rPr>
-        <w:t>Standard policy packages improve outcomes and slow projected decline, but they do not fully reverse the underlying demographic momentum. The retention bundle performs better than isolated policies because it combines multiple levers. Even so, the model remains bounded by strong lagged population dynamics. This means that economic, safety, and vulnerability improvements can shift projections in a favorable direction, but they may not be sufficient to reverse long-run decline without an additional recovery or return-migration dynamic.</w:t>
+        <w:t xml:space="preserve">Standard policy packages improve outcomes and slow projected decline, but they do not fully reverse the underlying demographic momentum. The retention bundle performs better than isolated policies because it combines multiple levers. Even so, the model remains bounded by strong lagged population dynamics. This </w:t>
+      </w:r>
+      <w:r>
+        <w:rPr>
+          <w:rFonts w:ascii="Times New Roman" w:hAnsi="Times New Roman" w:cs="Times New Roman"/>
+          <w:color w:val="000000" w:themeColor="text1"/>
+          <w:sz w:val="22"/>
+        </w:rPr>
+        <w:lastRenderedPageBreak/>
+        <w:t>means that economic, safety, and vulnerability improvements can shift projections in a favorable direction, but they may not be sufficient to reverse long-run decline without an additional recovery or return-migration dynamic.</w:t>
       </w:r>
     </w:p>
     <w:p>
@@ -3950,7 +4284,7 @@
           <w:color w:val="000000" w:themeColor="text1"/>
           <w:sz w:val="22"/>
         </w:rPr>
-        <w:t>The recovery-rebound sensitivity was designed to clarify the scale of intervention required for stabilization. In the supplied expansion material, a coordinated recovery-rebound bundle is described as retaining approximately 32,352 residents over the next five years compared with the baseline forecast. The longer-horizon endpoint comparison also shows the rebound scenario as the strongest population-retention case, because it adds recovery momentum beyond the model-implied policy response.</w:t>
+        <w:t>The recovery-rebound sensitivity was designed to clarify the scale of intervention required for stabilization, while also acknowledging uncertainty in the population estimates. The endpoint comparison shows that the standard recovery strategy improves the 2030 projection by approximately 32,352 residents relative to the baseline forecast. However, the recovery-rebound sensitivity produces a much larger shift, reaching approximately 3,253,715 residents by 2030, or about 245,401 more residents than the baseline endpoint. The figure also includes an uncertainty range around the endpoint, showing that the projected population should not be interpreted as an exact number. Instead, it represents an estimated range of plausible outcomes under the modeled assumptions. Unlike the standard policy packages, the rebound case rises slightly above the latest observed population level, suggesting that stabilization or temporary growth would require additional recovery momentum beyond the model-implied policy response, including stronger return migration and sustained structural improvements.</w:t>
       </w:r>
     </w:p>
     <w:p>
@@ -4101,7 +4435,6 @@
           <w:color w:val="000000" w:themeColor="text1"/>
           <w:sz w:val="22"/>
         </w:rPr>
-        <w:lastRenderedPageBreak/>
         <w:drawing>
           <wp:inline distT="0" distB="0" distL="0" distR="0" wp14:anchorId="3FEDEF78" wp14:editId="6E65F0F3">
             <wp:extent cx="5212288" cy="2377360"/>
@@ -4226,6 +4559,7 @@
           <w:sz w:val="22"/>
           <w:szCs w:val="22"/>
         </w:rPr>
+        <w:lastRenderedPageBreak/>
         <w:t>7.4 Recovery Bundle versus Recovery Rebound Sensitivity</w:t>
       </w:r>
     </w:p>
@@ -4397,7 +4731,6 @@
           <w:sz w:val="22"/>
           <w:szCs w:val="22"/>
         </w:rPr>
-        <w:lastRenderedPageBreak/>
         <w:t>9. Conclusion and Future Work</w:t>
       </w:r>
     </w:p>
@@ -4494,7 +4827,16 @@
           <w:color w:val="000000" w:themeColor="text1"/>
           <w:sz w:val="22"/>
         </w:rPr>
-        <w:t>Puerto Rico’s population change is persistent, structured, and predictable, but not entirely fixed. Model-based policy analysis suggests that interventions can improve outcomes, especially when they combine economic opportunity, resilience, safety, family support, and recovery capacity. However, stabilizing or increasing population likely requires coordinated strategies strong enough to change the underlying demographic trajectory rather than simply offset one or two isolated risk factors.</w:t>
+        <w:t xml:space="preserve">Puerto Rico’s population change is persistent, structured, and predictable, but not entirely fixed. Model-based policy analysis suggests that interventions can improve outcomes, especially when they combine economic opportunity, resilience, safety, family support, and recovery capacity. However, stabilizing or increasing </w:t>
+      </w:r>
+      <w:r>
+        <w:rPr>
+          <w:rFonts w:ascii="Times New Roman" w:hAnsi="Times New Roman" w:cs="Times New Roman"/>
+          <w:color w:val="000000" w:themeColor="text1"/>
+          <w:sz w:val="22"/>
+        </w:rPr>
+        <w:lastRenderedPageBreak/>
+        <w:t>population likely requires coordinated strategies strong enough to change the underlying demographic trajectory rather than simply offset one or two isolated risk factors.</w:t>
       </w:r>
     </w:p>
     <w:p>
@@ -4838,7 +5180,6 @@
           <w:color w:val="000000" w:themeColor="text1"/>
           <w:sz w:val="22"/>
         </w:rPr>
-        <w:lastRenderedPageBreak/>
         <w:t>Lundberg, S. M., &amp; Lee, S.-I. (2017). A Unified Approach to Interpreting Model Predictions. Advances in Neural Information Processing Systems.</w:t>
       </w:r>
     </w:p>
@@ -5069,7 +5410,8 @@
           <w:b/>
           <w:bCs/>
           <w:color w:val="000000" w:themeColor="text1"/>
-          <w:sz w:val="22"/>
+          <w:sz w:val="28"/>
+          <w:szCs w:val="28"/>
         </w:rPr>
       </w:pPr>
       <w:r>
@@ -5078,14 +5420,2941 @@
           <w:b/>
           <w:bCs/>
           <w:color w:val="000000" w:themeColor="text1"/>
-          <w:sz w:val="22"/>
-        </w:rPr>
+          <w:sz w:val="28"/>
+          <w:szCs w:val="28"/>
+        </w:rPr>
+        <w:lastRenderedPageBreak/>
         <w:t>Appendix A</w:t>
       </w:r>
+      <w:r>
+        <w:rPr>
+          <w:rFonts w:ascii="Times New Roman" w:hAnsi="Times New Roman" w:cs="Times New Roman"/>
+          <w:b/>
+          <w:bCs/>
+          <w:color w:val="000000" w:themeColor="text1"/>
+          <w:sz w:val="28"/>
+          <w:szCs w:val="28"/>
+        </w:rPr>
+        <w:t xml:space="preserve">: </w:t>
+      </w:r>
+      <w:r>
+        <w:rPr>
+          <w:rFonts w:ascii="Times New Roman" w:hAnsi="Times New Roman" w:cs="Times New Roman"/>
+          <w:b/>
+          <w:bCs/>
+          <w:color w:val="000000" w:themeColor="text1"/>
+          <w:sz w:val="28"/>
+          <w:szCs w:val="28"/>
+        </w:rPr>
+        <w:t>Supplemental Figures and Tables</w:t>
+      </w:r>
+    </w:p>
+    <w:p>
+      <w:pPr>
+        <w:pStyle w:val="Heading1"/>
+        <w:rPr>
+          <w:rFonts w:ascii="Times New Roman" w:hAnsi="Times New Roman" w:cs="Times New Roman"/>
+          <w:color w:val="000000" w:themeColor="text1"/>
+          <w:sz w:val="28"/>
+          <w:szCs w:val="24"/>
+        </w:rPr>
+      </w:pPr>
+      <w:r>
+        <w:rPr>
+          <w:rFonts w:ascii="Times New Roman" w:hAnsi="Times New Roman" w:cs="Times New Roman"/>
+          <w:color w:val="000000" w:themeColor="text1"/>
+          <w:sz w:val="28"/>
+          <w:szCs w:val="24"/>
+        </w:rPr>
+        <w:t>A1. Data Sources and Modeling Inputs</w:t>
+      </w:r>
+    </w:p>
+    <w:p>
+      <w:pPr>
+        <w:rPr>
+          <w:rFonts w:ascii="Times New Roman" w:hAnsi="Times New Roman" w:cs="Times New Roman"/>
+          <w:color w:val="000000" w:themeColor="text1"/>
+        </w:rPr>
+      </w:pPr>
+      <w:r>
+        <w:rPr>
+          <w:rFonts w:ascii="Times New Roman" w:hAnsi="Times New Roman" w:cs="Times New Roman"/>
+          <w:color w:val="000000" w:themeColor="text1"/>
+        </w:rPr>
+        <w:t>This table can be added to the appendix to document the main data categories and how each was used in the forecasting workflow.</w:t>
+      </w:r>
+    </w:p>
+    <w:tbl>
+      <w:tblPr>
+        <w:tblStyle w:val="TableGrid"/>
+        <w:tblW w:w="0" w:type="auto"/>
+        <w:jc w:val="center"/>
+        <w:tblLook w:val="04A0" w:firstRow="1" w:lastRow="0" w:firstColumn="1" w:lastColumn="0" w:noHBand="0" w:noVBand="1"/>
+      </w:tblPr>
+      <w:tblGrid>
+        <w:gridCol w:w="3360"/>
+        <w:gridCol w:w="3360"/>
+        <w:gridCol w:w="3360"/>
+      </w:tblGrid>
+      <w:tr>
+        <w:trPr>
+          <w:jc w:val="center"/>
+        </w:trPr>
+        <w:tc>
+          <w:tcPr>
+            <w:tcW w:w="3360" w:type="dxa"/>
+            <w:shd w:val="clear" w:color="auto" w:fill="D9EAF7"/>
+          </w:tcPr>
+          <w:p>
+            <w:pPr>
+              <w:rPr>
+                <w:rFonts w:ascii="Times New Roman" w:hAnsi="Times New Roman" w:cs="Times New Roman"/>
+                <w:color w:val="000000" w:themeColor="text1"/>
+              </w:rPr>
+            </w:pPr>
+            <w:r>
+              <w:rPr>
+                <w:rFonts w:ascii="Times New Roman" w:hAnsi="Times New Roman" w:cs="Times New Roman"/>
+                <w:b/>
+                <w:color w:val="000000" w:themeColor="text1"/>
+                <w:sz w:val="18"/>
+              </w:rPr>
+              <w:t>Data category</w:t>
+            </w:r>
+          </w:p>
+        </w:tc>
+        <w:tc>
+          <w:tcPr>
+            <w:tcW w:w="3360" w:type="dxa"/>
+            <w:shd w:val="clear" w:color="auto" w:fill="D9EAF7"/>
+          </w:tcPr>
+          <w:p>
+            <w:pPr>
+              <w:rPr>
+                <w:rFonts w:ascii="Times New Roman" w:hAnsi="Times New Roman" w:cs="Times New Roman"/>
+                <w:color w:val="000000" w:themeColor="text1"/>
+              </w:rPr>
+            </w:pPr>
+            <w:r>
+              <w:rPr>
+                <w:rFonts w:ascii="Times New Roman" w:hAnsi="Times New Roman" w:cs="Times New Roman"/>
+                <w:b/>
+                <w:color w:val="000000" w:themeColor="text1"/>
+                <w:sz w:val="18"/>
+              </w:rPr>
+              <w:t>Example source</w:t>
+            </w:r>
+          </w:p>
+        </w:tc>
+        <w:tc>
+          <w:tcPr>
+            <w:tcW w:w="3360" w:type="dxa"/>
+            <w:shd w:val="clear" w:color="auto" w:fill="D9EAF7"/>
+          </w:tcPr>
+          <w:p>
+            <w:pPr>
+              <w:rPr>
+                <w:rFonts w:ascii="Times New Roman" w:hAnsi="Times New Roman" w:cs="Times New Roman"/>
+                <w:color w:val="000000" w:themeColor="text1"/>
+              </w:rPr>
+            </w:pPr>
+            <w:r>
+              <w:rPr>
+                <w:rFonts w:ascii="Times New Roman" w:hAnsi="Times New Roman" w:cs="Times New Roman"/>
+                <w:b/>
+                <w:color w:val="000000" w:themeColor="text1"/>
+                <w:sz w:val="18"/>
+              </w:rPr>
+              <w:t>Role in analysis</w:t>
+            </w:r>
+          </w:p>
+        </w:tc>
+      </w:tr>
+      <w:tr>
+        <w:trPr>
+          <w:jc w:val="center"/>
+        </w:trPr>
+        <w:tc>
+          <w:tcPr>
+            <w:tcW w:w="3360" w:type="dxa"/>
+          </w:tcPr>
+          <w:p>
+            <w:pPr>
+              <w:rPr>
+                <w:rFonts w:ascii="Times New Roman" w:hAnsi="Times New Roman" w:cs="Times New Roman"/>
+                <w:color w:val="000000" w:themeColor="text1"/>
+              </w:rPr>
+            </w:pPr>
+            <w:r>
+              <w:rPr>
+                <w:rFonts w:ascii="Times New Roman" w:hAnsi="Times New Roman" w:cs="Times New Roman"/>
+                <w:color w:val="000000" w:themeColor="text1"/>
+                <w:sz w:val="17"/>
+              </w:rPr>
+              <w:t>Population and demographic history</w:t>
+            </w:r>
+          </w:p>
+        </w:tc>
+        <w:tc>
+          <w:tcPr>
+            <w:tcW w:w="3360" w:type="dxa"/>
+          </w:tcPr>
+          <w:p>
+            <w:pPr>
+              <w:rPr>
+                <w:rFonts w:ascii="Times New Roman" w:hAnsi="Times New Roman" w:cs="Times New Roman"/>
+                <w:color w:val="000000" w:themeColor="text1"/>
+              </w:rPr>
+            </w:pPr>
+            <w:r>
+              <w:rPr>
+                <w:rFonts w:ascii="Times New Roman" w:hAnsi="Times New Roman" w:cs="Times New Roman"/>
+                <w:color w:val="000000" w:themeColor="text1"/>
+                <w:sz w:val="17"/>
+              </w:rPr>
+              <w:t>U.S. Census / population estimates</w:t>
+            </w:r>
+          </w:p>
+        </w:tc>
+        <w:tc>
+          <w:tcPr>
+            <w:tcW w:w="3360" w:type="dxa"/>
+          </w:tcPr>
+          <w:p>
+            <w:pPr>
+              <w:rPr>
+                <w:rFonts w:ascii="Times New Roman" w:hAnsi="Times New Roman" w:cs="Times New Roman"/>
+                <w:color w:val="000000" w:themeColor="text1"/>
+              </w:rPr>
+            </w:pPr>
+            <w:r>
+              <w:rPr>
+                <w:rFonts w:ascii="Times New Roman" w:hAnsi="Times New Roman" w:cs="Times New Roman"/>
+                <w:color w:val="000000" w:themeColor="text1"/>
+                <w:sz w:val="17"/>
+              </w:rPr>
+              <w:t>Population levels, annual change, lagged change, rolling change, and forward population-change targets</w:t>
+            </w:r>
+          </w:p>
+        </w:tc>
+      </w:tr>
+      <w:tr>
+        <w:trPr>
+          <w:jc w:val="center"/>
+        </w:trPr>
+        <w:tc>
+          <w:tcPr>
+            <w:tcW w:w="3360" w:type="dxa"/>
+          </w:tcPr>
+          <w:p>
+            <w:pPr>
+              <w:rPr>
+                <w:rFonts w:ascii="Times New Roman" w:hAnsi="Times New Roman" w:cs="Times New Roman"/>
+                <w:color w:val="000000" w:themeColor="text1"/>
+              </w:rPr>
+            </w:pPr>
+            <w:r>
+              <w:rPr>
+                <w:rFonts w:ascii="Times New Roman" w:hAnsi="Times New Roman" w:cs="Times New Roman"/>
+                <w:color w:val="000000" w:themeColor="text1"/>
+                <w:sz w:val="17"/>
+              </w:rPr>
+              <w:t>Vital statistics</w:t>
+            </w:r>
+          </w:p>
+        </w:tc>
+        <w:tc>
+          <w:tcPr>
+            <w:tcW w:w="3360" w:type="dxa"/>
+          </w:tcPr>
+          <w:p>
+            <w:pPr>
+              <w:rPr>
+                <w:rFonts w:ascii="Times New Roman" w:hAnsi="Times New Roman" w:cs="Times New Roman"/>
+                <w:color w:val="000000" w:themeColor="text1"/>
+              </w:rPr>
+            </w:pPr>
+            <w:r>
+              <w:rPr>
+                <w:rFonts w:ascii="Times New Roman" w:hAnsi="Times New Roman" w:cs="Times New Roman"/>
+                <w:color w:val="000000" w:themeColor="text1"/>
+                <w:sz w:val="17"/>
+              </w:rPr>
+              <w:t>Puerto Rico vital statistics / Census-derived fertility measures</w:t>
+            </w:r>
+          </w:p>
+        </w:tc>
+        <w:tc>
+          <w:tcPr>
+            <w:tcW w:w="3360" w:type="dxa"/>
+          </w:tcPr>
+          <w:p>
+            <w:pPr>
+              <w:rPr>
+                <w:rFonts w:ascii="Times New Roman" w:hAnsi="Times New Roman" w:cs="Times New Roman"/>
+                <w:color w:val="000000" w:themeColor="text1"/>
+              </w:rPr>
+            </w:pPr>
+            <w:r>
+              <w:rPr>
+                <w:rFonts w:ascii="Times New Roman" w:hAnsi="Times New Roman" w:cs="Times New Roman"/>
+                <w:color w:val="000000" w:themeColor="text1"/>
+                <w:sz w:val="17"/>
+              </w:rPr>
+              <w:t>Births, deaths, natural-change context, and demographic momentum</w:t>
+            </w:r>
+          </w:p>
+        </w:tc>
+      </w:tr>
+      <w:tr>
+        <w:trPr>
+          <w:jc w:val="center"/>
+        </w:trPr>
+        <w:tc>
+          <w:tcPr>
+            <w:tcW w:w="3360" w:type="dxa"/>
+          </w:tcPr>
+          <w:p>
+            <w:pPr>
+              <w:rPr>
+                <w:rFonts w:ascii="Times New Roman" w:hAnsi="Times New Roman" w:cs="Times New Roman"/>
+                <w:color w:val="000000" w:themeColor="text1"/>
+              </w:rPr>
+            </w:pPr>
+            <w:r>
+              <w:rPr>
+                <w:rFonts w:ascii="Times New Roman" w:hAnsi="Times New Roman" w:cs="Times New Roman"/>
+                <w:color w:val="000000" w:themeColor="text1"/>
+                <w:sz w:val="17"/>
+              </w:rPr>
+              <w:t>Economic conditions</w:t>
+            </w:r>
+          </w:p>
+        </w:tc>
+        <w:tc>
+          <w:tcPr>
+            <w:tcW w:w="3360" w:type="dxa"/>
+          </w:tcPr>
+          <w:p>
+            <w:pPr>
+              <w:rPr>
+                <w:rFonts w:ascii="Times New Roman" w:hAnsi="Times New Roman" w:cs="Times New Roman"/>
+                <w:color w:val="000000" w:themeColor="text1"/>
+              </w:rPr>
+            </w:pPr>
+            <w:r>
+              <w:rPr>
+                <w:rFonts w:ascii="Times New Roman" w:hAnsi="Times New Roman" w:cs="Times New Roman"/>
+                <w:color w:val="000000" w:themeColor="text1"/>
+                <w:sz w:val="17"/>
+              </w:rPr>
+              <w:t>ACS labor and socioeconomic indicators; County Business Patterns</w:t>
+            </w:r>
+          </w:p>
+        </w:tc>
+        <w:tc>
+          <w:tcPr>
+            <w:tcW w:w="3360" w:type="dxa"/>
+          </w:tcPr>
+          <w:p>
+            <w:pPr>
+              <w:rPr>
+                <w:rFonts w:ascii="Times New Roman" w:hAnsi="Times New Roman" w:cs="Times New Roman"/>
+                <w:color w:val="000000" w:themeColor="text1"/>
+              </w:rPr>
+            </w:pPr>
+            <w:r>
+              <w:rPr>
+                <w:rFonts w:ascii="Times New Roman" w:hAnsi="Times New Roman" w:cs="Times New Roman"/>
+                <w:color w:val="000000" w:themeColor="text1"/>
+                <w:sz w:val="17"/>
+              </w:rPr>
+              <w:t>Income, employment, establishments, payroll, and business activity</w:t>
+            </w:r>
+          </w:p>
+        </w:tc>
+      </w:tr>
+      <w:tr>
+        <w:trPr>
+          <w:jc w:val="center"/>
+        </w:trPr>
+        <w:tc>
+          <w:tcPr>
+            <w:tcW w:w="3360" w:type="dxa"/>
+          </w:tcPr>
+          <w:p>
+            <w:pPr>
+              <w:rPr>
+                <w:rFonts w:ascii="Times New Roman" w:hAnsi="Times New Roman" w:cs="Times New Roman"/>
+                <w:color w:val="000000" w:themeColor="text1"/>
+              </w:rPr>
+            </w:pPr>
+            <w:r>
+              <w:rPr>
+                <w:rFonts w:ascii="Times New Roman" w:hAnsi="Times New Roman" w:cs="Times New Roman"/>
+                <w:color w:val="000000" w:themeColor="text1"/>
+                <w:sz w:val="17"/>
+              </w:rPr>
+              <w:t>Social vulnerability</w:t>
+            </w:r>
+          </w:p>
+        </w:tc>
+        <w:tc>
+          <w:tcPr>
+            <w:tcW w:w="3360" w:type="dxa"/>
+          </w:tcPr>
+          <w:p>
+            <w:pPr>
+              <w:rPr>
+                <w:rFonts w:ascii="Times New Roman" w:hAnsi="Times New Roman" w:cs="Times New Roman"/>
+                <w:color w:val="000000" w:themeColor="text1"/>
+              </w:rPr>
+            </w:pPr>
+            <w:r>
+              <w:rPr>
+                <w:rFonts w:ascii="Times New Roman" w:hAnsi="Times New Roman" w:cs="Times New Roman"/>
+                <w:color w:val="000000" w:themeColor="text1"/>
+                <w:sz w:val="17"/>
+              </w:rPr>
+              <w:t>CDC SVI-style indicators and related socioeconomic measures</w:t>
+            </w:r>
+          </w:p>
+        </w:tc>
+        <w:tc>
+          <w:tcPr>
+            <w:tcW w:w="3360" w:type="dxa"/>
+          </w:tcPr>
+          <w:p>
+            <w:pPr>
+              <w:rPr>
+                <w:rFonts w:ascii="Times New Roman" w:hAnsi="Times New Roman" w:cs="Times New Roman"/>
+                <w:color w:val="000000" w:themeColor="text1"/>
+              </w:rPr>
+            </w:pPr>
+            <w:r>
+              <w:rPr>
+                <w:rFonts w:ascii="Times New Roman" w:hAnsi="Times New Roman" w:cs="Times New Roman"/>
+                <w:color w:val="000000" w:themeColor="text1"/>
+                <w:sz w:val="17"/>
+              </w:rPr>
+              <w:t>Vulnerability, housing, transportation, and resilience-related context</w:t>
+            </w:r>
+          </w:p>
+        </w:tc>
+      </w:tr>
+      <w:tr>
+        <w:trPr>
+          <w:jc w:val="center"/>
+        </w:trPr>
+        <w:tc>
+          <w:tcPr>
+            <w:tcW w:w="3360" w:type="dxa"/>
+          </w:tcPr>
+          <w:p>
+            <w:pPr>
+              <w:rPr>
+                <w:rFonts w:ascii="Times New Roman" w:hAnsi="Times New Roman" w:cs="Times New Roman"/>
+                <w:color w:val="000000" w:themeColor="text1"/>
+              </w:rPr>
+            </w:pPr>
+            <w:r>
+              <w:rPr>
+                <w:rFonts w:ascii="Times New Roman" w:hAnsi="Times New Roman" w:cs="Times New Roman"/>
+                <w:color w:val="000000" w:themeColor="text1"/>
+                <w:sz w:val="17"/>
+              </w:rPr>
+              <w:t>Public safety</w:t>
+            </w:r>
+          </w:p>
+        </w:tc>
+        <w:tc>
+          <w:tcPr>
+            <w:tcW w:w="3360" w:type="dxa"/>
+          </w:tcPr>
+          <w:p>
+            <w:pPr>
+              <w:rPr>
+                <w:rFonts w:ascii="Times New Roman" w:hAnsi="Times New Roman" w:cs="Times New Roman"/>
+                <w:color w:val="000000" w:themeColor="text1"/>
+              </w:rPr>
+            </w:pPr>
+            <w:r>
+              <w:rPr>
+                <w:rFonts w:ascii="Times New Roman" w:hAnsi="Times New Roman" w:cs="Times New Roman"/>
+                <w:color w:val="000000" w:themeColor="text1"/>
+                <w:sz w:val="17"/>
+              </w:rPr>
+              <w:t>Puerto Rico Police Department / crime indicators</w:t>
+            </w:r>
+          </w:p>
+        </w:tc>
+        <w:tc>
+          <w:tcPr>
+            <w:tcW w:w="3360" w:type="dxa"/>
+          </w:tcPr>
+          <w:p>
+            <w:pPr>
+              <w:rPr>
+                <w:rFonts w:ascii="Times New Roman" w:hAnsi="Times New Roman" w:cs="Times New Roman"/>
+                <w:color w:val="000000" w:themeColor="text1"/>
+              </w:rPr>
+            </w:pPr>
+            <w:r>
+              <w:rPr>
+                <w:rFonts w:ascii="Times New Roman" w:hAnsi="Times New Roman" w:cs="Times New Roman"/>
+                <w:color w:val="000000" w:themeColor="text1"/>
+                <w:sz w:val="17"/>
+              </w:rPr>
+              <w:t>Quality-of-life and retention-related context</w:t>
+            </w:r>
+          </w:p>
+        </w:tc>
+      </w:tr>
+      <w:tr>
+        <w:trPr>
+          <w:jc w:val="center"/>
+        </w:trPr>
+        <w:tc>
+          <w:tcPr>
+            <w:tcW w:w="3360" w:type="dxa"/>
+          </w:tcPr>
+          <w:p>
+            <w:pPr>
+              <w:rPr>
+                <w:rFonts w:ascii="Times New Roman" w:hAnsi="Times New Roman" w:cs="Times New Roman"/>
+                <w:color w:val="000000" w:themeColor="text1"/>
+              </w:rPr>
+            </w:pPr>
+            <w:r>
+              <w:rPr>
+                <w:rFonts w:ascii="Times New Roman" w:hAnsi="Times New Roman" w:cs="Times New Roman"/>
+                <w:color w:val="000000" w:themeColor="text1"/>
+                <w:sz w:val="17"/>
+              </w:rPr>
+              <w:t>Hurricane exposure</w:t>
+            </w:r>
+          </w:p>
+        </w:tc>
+        <w:tc>
+          <w:tcPr>
+            <w:tcW w:w="3360" w:type="dxa"/>
+          </w:tcPr>
+          <w:p>
+            <w:pPr>
+              <w:rPr>
+                <w:rFonts w:ascii="Times New Roman" w:hAnsi="Times New Roman" w:cs="Times New Roman"/>
+                <w:color w:val="000000" w:themeColor="text1"/>
+              </w:rPr>
+            </w:pPr>
+            <w:r>
+              <w:rPr>
+                <w:rFonts w:ascii="Times New Roman" w:hAnsi="Times New Roman" w:cs="Times New Roman"/>
+                <w:color w:val="000000" w:themeColor="text1"/>
+                <w:sz w:val="17"/>
+              </w:rPr>
+              <w:t>NOAA hurricane track and intensity data</w:t>
+            </w:r>
+          </w:p>
+        </w:tc>
+        <w:tc>
+          <w:tcPr>
+            <w:tcW w:w="3360" w:type="dxa"/>
+          </w:tcPr>
+          <w:p>
+            <w:pPr>
+              <w:rPr>
+                <w:rFonts w:ascii="Times New Roman" w:hAnsi="Times New Roman" w:cs="Times New Roman"/>
+                <w:color w:val="000000" w:themeColor="text1"/>
+              </w:rPr>
+            </w:pPr>
+            <w:r>
+              <w:rPr>
+                <w:rFonts w:ascii="Times New Roman" w:hAnsi="Times New Roman" w:cs="Times New Roman"/>
+                <w:color w:val="000000" w:themeColor="text1"/>
+                <w:sz w:val="17"/>
+              </w:rPr>
+              <w:t>Hurricane scenario variables and disaster stress testing</w:t>
+            </w:r>
+          </w:p>
+        </w:tc>
+      </w:tr>
+      <w:tr>
+        <w:trPr>
+          <w:jc w:val="center"/>
+        </w:trPr>
+        <w:tc>
+          <w:tcPr>
+            <w:tcW w:w="3360" w:type="dxa"/>
+          </w:tcPr>
+          <w:p>
+            <w:pPr>
+              <w:rPr>
+                <w:rFonts w:ascii="Times New Roman" w:hAnsi="Times New Roman" w:cs="Times New Roman"/>
+                <w:color w:val="000000" w:themeColor="text1"/>
+              </w:rPr>
+            </w:pPr>
+            <w:r>
+              <w:rPr>
+                <w:rFonts w:ascii="Times New Roman" w:hAnsi="Times New Roman" w:cs="Times New Roman"/>
+                <w:color w:val="000000" w:themeColor="text1"/>
+                <w:sz w:val="17"/>
+              </w:rPr>
+              <w:t>Earthquake exposure</w:t>
+            </w:r>
+          </w:p>
+        </w:tc>
+        <w:tc>
+          <w:tcPr>
+            <w:tcW w:w="3360" w:type="dxa"/>
+          </w:tcPr>
+          <w:p>
+            <w:pPr>
+              <w:rPr>
+                <w:rFonts w:ascii="Times New Roman" w:hAnsi="Times New Roman" w:cs="Times New Roman"/>
+                <w:color w:val="000000" w:themeColor="text1"/>
+              </w:rPr>
+            </w:pPr>
+            <w:r>
+              <w:rPr>
+                <w:rFonts w:ascii="Times New Roman" w:hAnsi="Times New Roman" w:cs="Times New Roman"/>
+                <w:color w:val="000000" w:themeColor="text1"/>
+                <w:sz w:val="17"/>
+              </w:rPr>
+              <w:t>USGS earthquake catalogs</w:t>
+            </w:r>
+          </w:p>
+        </w:tc>
+        <w:tc>
+          <w:tcPr>
+            <w:tcW w:w="3360" w:type="dxa"/>
+          </w:tcPr>
+          <w:p>
+            <w:pPr>
+              <w:rPr>
+                <w:rFonts w:ascii="Times New Roman" w:hAnsi="Times New Roman" w:cs="Times New Roman"/>
+                <w:color w:val="000000" w:themeColor="text1"/>
+              </w:rPr>
+            </w:pPr>
+            <w:r>
+              <w:rPr>
+                <w:rFonts w:ascii="Times New Roman" w:hAnsi="Times New Roman" w:cs="Times New Roman"/>
+                <w:color w:val="000000" w:themeColor="text1"/>
+                <w:sz w:val="17"/>
+              </w:rPr>
+              <w:t>Earthquake scenario variables and seismic stress testing</w:t>
+            </w:r>
+          </w:p>
+        </w:tc>
+      </w:tr>
+      <w:tr>
+        <w:trPr>
+          <w:jc w:val="center"/>
+        </w:trPr>
+        <w:tc>
+          <w:tcPr>
+            <w:tcW w:w="3360" w:type="dxa"/>
+          </w:tcPr>
+          <w:p>
+            <w:pPr>
+              <w:rPr>
+                <w:rFonts w:ascii="Times New Roman" w:hAnsi="Times New Roman" w:cs="Times New Roman"/>
+                <w:color w:val="000000" w:themeColor="text1"/>
+              </w:rPr>
+            </w:pPr>
+            <w:r>
+              <w:rPr>
+                <w:rFonts w:ascii="Times New Roman" w:hAnsi="Times New Roman" w:cs="Times New Roman"/>
+                <w:color w:val="000000" w:themeColor="text1"/>
+                <w:sz w:val="17"/>
+              </w:rPr>
+              <w:t>Regional structure</w:t>
+            </w:r>
+          </w:p>
+        </w:tc>
+        <w:tc>
+          <w:tcPr>
+            <w:tcW w:w="3360" w:type="dxa"/>
+          </w:tcPr>
+          <w:p>
+            <w:pPr>
+              <w:rPr>
+                <w:rFonts w:ascii="Times New Roman" w:hAnsi="Times New Roman" w:cs="Times New Roman"/>
+                <w:color w:val="000000" w:themeColor="text1"/>
+              </w:rPr>
+            </w:pPr>
+            <w:r>
+              <w:rPr>
+                <w:rFonts w:ascii="Times New Roman" w:hAnsi="Times New Roman" w:cs="Times New Roman"/>
+                <w:color w:val="000000" w:themeColor="text1"/>
+                <w:sz w:val="17"/>
+              </w:rPr>
+              <w:t>Municipality-to-region groupings generated in the analysis</w:t>
+            </w:r>
+          </w:p>
+        </w:tc>
+        <w:tc>
+          <w:tcPr>
+            <w:tcW w:w="3360" w:type="dxa"/>
+          </w:tcPr>
+          <w:p>
+            <w:pPr>
+              <w:rPr>
+                <w:rFonts w:ascii="Times New Roman" w:hAnsi="Times New Roman" w:cs="Times New Roman"/>
+                <w:color w:val="000000" w:themeColor="text1"/>
+              </w:rPr>
+            </w:pPr>
+            <w:r>
+              <w:rPr>
+                <w:rFonts w:ascii="Times New Roman" w:hAnsi="Times New Roman" w:cs="Times New Roman"/>
+                <w:color w:val="000000" w:themeColor="text1"/>
+                <w:sz w:val="17"/>
+              </w:rPr>
+              <w:t>Regional aggregation, interpretation, and islandwide forecast summaries</w:t>
+            </w:r>
+          </w:p>
+        </w:tc>
+      </w:tr>
+    </w:tbl>
+    <w:p>
+      <w:pPr>
+        <w:pStyle w:val="ListBullet"/>
+        <w:numPr>
+          <w:ilvl w:val="0"/>
+          <w:numId w:val="0"/>
+        </w:numPr>
+        <w:spacing w:after="60"/>
+        <w:rPr>
+          <w:rFonts w:ascii="Times New Roman" w:hAnsi="Times New Roman" w:cs="Times New Roman"/>
+          <w:i/>
+          <w:color w:val="000000" w:themeColor="text1"/>
+        </w:rPr>
+      </w:pPr>
+      <w:r>
+        <w:rPr>
+          <w:rFonts w:ascii="Times New Roman" w:hAnsi="Times New Roman" w:cs="Times New Roman"/>
+          <w:b/>
+          <w:i/>
+          <w:color w:val="000000" w:themeColor="text1"/>
+        </w:rPr>
+        <w:t xml:space="preserve">Appendix Table A1. </w:t>
+      </w:r>
+      <w:r>
+        <w:rPr>
+          <w:rFonts w:ascii="Times New Roman" w:hAnsi="Times New Roman" w:cs="Times New Roman"/>
+          <w:i/>
+          <w:color w:val="000000" w:themeColor="text1"/>
+        </w:rPr>
+        <w:t>Data categories, example sources, and role in the population forecasting workflow.</w:t>
+      </w:r>
+    </w:p>
+    <w:p>
+      <w:pPr>
+        <w:pStyle w:val="ListBullet"/>
+        <w:numPr>
+          <w:ilvl w:val="0"/>
+          <w:numId w:val="0"/>
+        </w:numPr>
+        <w:spacing w:after="60"/>
+        <w:rPr>
+          <w:rFonts w:ascii="Times New Roman" w:hAnsi="Times New Roman" w:cs="Times New Roman"/>
+          <w:i/>
+          <w:color w:val="000000" w:themeColor="text1"/>
+        </w:rPr>
+      </w:pPr>
+    </w:p>
+    <w:p>
+      <w:pPr>
+        <w:pStyle w:val="Heading1"/>
+        <w:rPr>
+          <w:rFonts w:ascii="Times New Roman" w:hAnsi="Times New Roman" w:cs="Times New Roman"/>
+          <w:color w:val="000000" w:themeColor="text1"/>
+          <w:sz w:val="28"/>
+          <w:szCs w:val="24"/>
+        </w:rPr>
+      </w:pPr>
+      <w:r>
+        <w:rPr>
+          <w:rFonts w:ascii="Times New Roman" w:hAnsi="Times New Roman" w:cs="Times New Roman"/>
+          <w:color w:val="000000" w:themeColor="text1"/>
+          <w:sz w:val="28"/>
+          <w:szCs w:val="24"/>
+        </w:rPr>
+        <w:t>A2. Model Selection and Final Forecasting Backbone</w:t>
+      </w:r>
+    </w:p>
+    <w:p>
+      <w:pPr>
+        <w:jc w:val="center"/>
+        <w:rPr>
+          <w:rFonts w:ascii="Times New Roman" w:hAnsi="Times New Roman" w:cs="Times New Roman"/>
+          <w:color w:val="000000" w:themeColor="text1"/>
+        </w:rPr>
+      </w:pPr>
+      <w:r>
+        <w:rPr>
+          <w:rFonts w:ascii="Times New Roman" w:hAnsi="Times New Roman" w:cs="Times New Roman"/>
+          <w:noProof/>
+          <w:color w:val="000000" w:themeColor="text1"/>
+        </w:rPr>
+        <w:drawing>
+          <wp:inline distT="0" distB="0" distL="0" distR="0" wp14:anchorId="4CAA4CAD" wp14:editId="6948EA27">
+            <wp:extent cx="5852160" cy="2272103"/>
+            <wp:effectExtent l="0" t="0" r="0" b="0"/>
+            <wp:docPr id="3" name="Picture 3" descr="A screenshot of a test results&#10;&#10;AI-generated content may be incorrect."/>
+            <wp:cNvGraphicFramePr>
+              <a:graphicFrameLocks xmlns:a="http://schemas.openxmlformats.org/drawingml/2006/main" noChangeAspect="1"/>
+            </wp:cNvGraphicFramePr>
+            <a:graphic xmlns:a="http://schemas.openxmlformats.org/drawingml/2006/main">
+              <a:graphicData uri="http://schemas.openxmlformats.org/drawingml/2006/picture">
+                <pic:pic xmlns:pic="http://schemas.openxmlformats.org/drawingml/2006/picture">
+                  <pic:nvPicPr>
+                    <pic:cNvPr id="3" name="Picture 3" descr="A screenshot of a test results&#10;&#10;AI-generated content may be incorrect."/>
+                    <pic:cNvPicPr/>
+                  </pic:nvPicPr>
+                  <pic:blipFill>
+                    <a:blip r:embed="rId24"/>
+                    <a:stretch>
+                      <a:fillRect/>
+                    </a:stretch>
+                  </pic:blipFill>
+                  <pic:spPr>
+                    <a:xfrm>
+                      <a:off x="0" y="0"/>
+                      <a:ext cx="5852160" cy="2272103"/>
+                    </a:xfrm>
+                    <a:prstGeom prst="rect">
+                      <a:avLst/>
+                    </a:prstGeom>
+                  </pic:spPr>
+                </pic:pic>
+              </a:graphicData>
+            </a:graphic>
+          </wp:inline>
+        </w:drawing>
+      </w:r>
+    </w:p>
+    <w:p>
+      <w:pPr>
+        <w:jc w:val="center"/>
+        <w:rPr>
+          <w:rFonts w:ascii="Times New Roman" w:hAnsi="Times New Roman" w:cs="Times New Roman"/>
+          <w:color w:val="000000" w:themeColor="text1"/>
+        </w:rPr>
+      </w:pPr>
+      <w:r>
+        <w:rPr>
+          <w:rFonts w:ascii="Times New Roman" w:hAnsi="Times New Roman" w:cs="Times New Roman"/>
+          <w:b/>
+          <w:i/>
+          <w:color w:val="000000" w:themeColor="text1"/>
+        </w:rPr>
+        <w:t xml:space="preserve">Appendix Figure A2. </w:t>
+      </w:r>
+      <w:r>
+        <w:rPr>
+          <w:rFonts w:ascii="Times New Roman" w:hAnsi="Times New Roman" w:cs="Times New Roman"/>
+          <w:i/>
+          <w:color w:val="000000" w:themeColor="text1"/>
+        </w:rPr>
+        <w:t>Candidate model comparison showing the tuned Lasso model as the strongest selected forecasting backbone under the temporal evaluation framework.</w:t>
+      </w:r>
+    </w:p>
+    <w:p>
+      <w:pPr>
+        <w:pStyle w:val="ListBullet"/>
+        <w:numPr>
+          <w:ilvl w:val="0"/>
+          <w:numId w:val="0"/>
+        </w:numPr>
+        <w:spacing w:after="60"/>
+        <w:rPr>
+          <w:rFonts w:ascii="Times New Roman" w:hAnsi="Times New Roman" w:cs="Times New Roman"/>
+          <w:b/>
+          <w:bCs/>
+          <w:color w:val="000000" w:themeColor="text1"/>
+          <w:sz w:val="22"/>
+        </w:rPr>
+      </w:pPr>
+    </w:p>
+    <w:p>
+      <w:pPr>
+        <w:pStyle w:val="ListBullet"/>
+        <w:numPr>
+          <w:ilvl w:val="0"/>
+          <w:numId w:val="0"/>
+        </w:numPr>
+        <w:spacing w:after="60"/>
+        <w:rPr>
+          <w:rFonts w:ascii="Times New Roman" w:hAnsi="Times New Roman" w:cs="Times New Roman"/>
+          <w:b/>
+          <w:bCs/>
+          <w:color w:val="000000" w:themeColor="text1"/>
+          <w:sz w:val="22"/>
+        </w:rPr>
+      </w:pPr>
+    </w:p>
+    <w:p>
+      <w:pPr>
+        <w:pStyle w:val="ListBullet"/>
+        <w:numPr>
+          <w:ilvl w:val="0"/>
+          <w:numId w:val="0"/>
+        </w:numPr>
+        <w:spacing w:after="60"/>
+        <w:rPr>
+          <w:rFonts w:ascii="Times New Roman" w:hAnsi="Times New Roman" w:cs="Times New Roman"/>
+          <w:b/>
+          <w:bCs/>
+          <w:color w:val="000000" w:themeColor="text1"/>
+          <w:sz w:val="22"/>
+        </w:rPr>
+      </w:pPr>
+    </w:p>
+    <w:p>
+      <w:pPr>
+        <w:pStyle w:val="ListBullet"/>
+        <w:numPr>
+          <w:ilvl w:val="0"/>
+          <w:numId w:val="0"/>
+        </w:numPr>
+        <w:spacing w:after="60"/>
+        <w:rPr>
+          <w:rFonts w:ascii="Times New Roman" w:hAnsi="Times New Roman" w:cs="Times New Roman"/>
+          <w:b/>
+          <w:bCs/>
+          <w:color w:val="000000" w:themeColor="text1"/>
+          <w:sz w:val="22"/>
+        </w:rPr>
+      </w:pPr>
+    </w:p>
+    <w:p>
+      <w:pPr>
+        <w:pStyle w:val="ListBullet"/>
+        <w:numPr>
+          <w:ilvl w:val="0"/>
+          <w:numId w:val="0"/>
+        </w:numPr>
+        <w:spacing w:after="60"/>
+        <w:rPr>
+          <w:rFonts w:ascii="Times New Roman" w:hAnsi="Times New Roman" w:cs="Times New Roman"/>
+          <w:b/>
+          <w:bCs/>
+          <w:color w:val="000000" w:themeColor="text1"/>
+          <w:sz w:val="22"/>
+        </w:rPr>
+      </w:pPr>
+    </w:p>
+    <w:p>
+      <w:pPr>
+        <w:pStyle w:val="ListBullet"/>
+        <w:numPr>
+          <w:ilvl w:val="0"/>
+          <w:numId w:val="0"/>
+        </w:numPr>
+        <w:spacing w:after="60"/>
+        <w:rPr>
+          <w:rFonts w:ascii="Times New Roman" w:hAnsi="Times New Roman" w:cs="Times New Roman"/>
+          <w:b/>
+          <w:bCs/>
+          <w:color w:val="000000" w:themeColor="text1"/>
+          <w:sz w:val="22"/>
+        </w:rPr>
+      </w:pPr>
+    </w:p>
+    <w:p>
+      <w:pPr>
+        <w:pStyle w:val="Heading1"/>
+        <w:rPr>
+          <w:rFonts w:ascii="Times New Roman" w:hAnsi="Times New Roman" w:cs="Times New Roman"/>
+          <w:color w:val="000000" w:themeColor="text1"/>
+          <w:sz w:val="28"/>
+          <w:szCs w:val="24"/>
+        </w:rPr>
+      </w:pPr>
+      <w:r>
+        <w:rPr>
+          <w:rFonts w:ascii="Times New Roman" w:hAnsi="Times New Roman" w:cs="Times New Roman"/>
+          <w:color w:val="000000" w:themeColor="text1"/>
+          <w:sz w:val="28"/>
+          <w:szCs w:val="24"/>
+        </w:rPr>
+        <w:lastRenderedPageBreak/>
+        <w:t>A3. Lead-Lag Driver Timing and Interpretability</w:t>
+      </w:r>
+    </w:p>
+    <w:p>
+      <w:pPr>
+        <w:jc w:val="center"/>
+        <w:rPr>
+          <w:rFonts w:ascii="Times New Roman" w:hAnsi="Times New Roman" w:cs="Times New Roman"/>
+          <w:color w:val="000000" w:themeColor="text1"/>
+        </w:rPr>
+      </w:pPr>
+      <w:r>
+        <w:rPr>
+          <w:rFonts w:ascii="Times New Roman" w:hAnsi="Times New Roman" w:cs="Times New Roman"/>
+          <w:noProof/>
+          <w:color w:val="000000" w:themeColor="text1"/>
+        </w:rPr>
+        <w:drawing>
+          <wp:inline distT="0" distB="0" distL="0" distR="0" wp14:anchorId="7015405B" wp14:editId="39483663">
+            <wp:extent cx="5943600" cy="4125832"/>
+            <wp:effectExtent l="0" t="0" r="0" b="0"/>
+            <wp:docPr id="4" name="Picture 4" descr="A graph with blue and white lines&#10;&#10;AI-generated content may be incorrect."/>
+            <wp:cNvGraphicFramePr>
+              <a:graphicFrameLocks xmlns:a="http://schemas.openxmlformats.org/drawingml/2006/main" noChangeAspect="1"/>
+            </wp:cNvGraphicFramePr>
+            <a:graphic xmlns:a="http://schemas.openxmlformats.org/drawingml/2006/main">
+              <a:graphicData uri="http://schemas.openxmlformats.org/drawingml/2006/picture">
+                <pic:pic xmlns:pic="http://schemas.openxmlformats.org/drawingml/2006/picture">
+                  <pic:nvPicPr>
+                    <pic:cNvPr id="4" name="Picture 4" descr="A graph with blue and white lines&#10;&#10;AI-generated content may be incorrect."/>
+                    <pic:cNvPicPr/>
+                  </pic:nvPicPr>
+                  <pic:blipFill>
+                    <a:blip r:embed="rId25"/>
+                    <a:stretch>
+                      <a:fillRect/>
+                    </a:stretch>
+                  </pic:blipFill>
+                  <pic:spPr>
+                    <a:xfrm>
+                      <a:off x="0" y="0"/>
+                      <a:ext cx="5943600" cy="4125832"/>
+                    </a:xfrm>
+                    <a:prstGeom prst="rect">
+                      <a:avLst/>
+                    </a:prstGeom>
+                  </pic:spPr>
+                </pic:pic>
+              </a:graphicData>
+            </a:graphic>
+          </wp:inline>
+        </w:drawing>
+      </w:r>
+    </w:p>
+    <w:p>
+      <w:pPr>
+        <w:jc w:val="center"/>
+        <w:rPr>
+          <w:rFonts w:ascii="Times New Roman" w:hAnsi="Times New Roman" w:cs="Times New Roman"/>
+          <w:color w:val="000000" w:themeColor="text1"/>
+        </w:rPr>
+      </w:pPr>
+      <w:r>
+        <w:rPr>
+          <w:rFonts w:ascii="Times New Roman" w:hAnsi="Times New Roman" w:cs="Times New Roman"/>
+          <w:b/>
+          <w:i/>
+          <w:color w:val="000000" w:themeColor="text1"/>
+        </w:rPr>
+        <w:t xml:space="preserve">Appendix Figure A3. </w:t>
+      </w:r>
+      <w:r>
+        <w:rPr>
+          <w:rFonts w:ascii="Times New Roman" w:hAnsi="Times New Roman" w:cs="Times New Roman"/>
+          <w:i/>
+          <w:color w:val="000000" w:themeColor="text1"/>
+        </w:rPr>
+        <w:t>Lead-lag permutation importance by driver and lag. The figure shows that timing matters: some disaster and structural variables influence population change with delayed effects rather than only immediate effects.</w:t>
+      </w:r>
+    </w:p>
+    <w:p>
+      <w:pPr>
+        <w:pStyle w:val="Heading1"/>
+        <w:rPr>
+          <w:rFonts w:ascii="Times New Roman" w:hAnsi="Times New Roman" w:cs="Times New Roman"/>
+          <w:color w:val="000000" w:themeColor="text1"/>
+          <w:sz w:val="28"/>
+          <w:szCs w:val="24"/>
+        </w:rPr>
+      </w:pPr>
+      <w:r>
+        <w:rPr>
+          <w:rFonts w:ascii="Times New Roman" w:hAnsi="Times New Roman" w:cs="Times New Roman"/>
+          <w:color w:val="000000" w:themeColor="text1"/>
+          <w:sz w:val="28"/>
+          <w:szCs w:val="24"/>
+        </w:rPr>
+        <w:t>A4. Policy Package Definitions</w:t>
+      </w:r>
+    </w:p>
+    <w:tbl>
+      <w:tblPr>
+        <w:tblStyle w:val="TableGrid"/>
+        <w:tblW w:w="0" w:type="auto"/>
+        <w:jc w:val="center"/>
+        <w:tblLook w:val="04A0" w:firstRow="1" w:lastRow="0" w:firstColumn="1" w:lastColumn="0" w:noHBand="0" w:noVBand="1"/>
+      </w:tblPr>
+      <w:tblGrid>
+        <w:gridCol w:w="2250"/>
+        <w:gridCol w:w="2610"/>
+        <w:gridCol w:w="2700"/>
+        <w:gridCol w:w="2520"/>
+      </w:tblGrid>
+      <w:tr>
+        <w:trPr>
+          <w:jc w:val="center"/>
+        </w:trPr>
+        <w:tc>
+          <w:tcPr>
+            <w:tcW w:w="2250" w:type="dxa"/>
+            <w:shd w:val="clear" w:color="auto" w:fill="D9EAF7"/>
+          </w:tcPr>
+          <w:p>
+            <w:pPr>
+              <w:rPr>
+                <w:rFonts w:ascii="Times New Roman" w:hAnsi="Times New Roman" w:cs="Times New Roman"/>
+                <w:color w:val="000000" w:themeColor="text1"/>
+                <w:sz w:val="18"/>
+                <w:szCs w:val="24"/>
+              </w:rPr>
+            </w:pPr>
+            <w:r>
+              <w:rPr>
+                <w:rFonts w:ascii="Times New Roman" w:hAnsi="Times New Roman" w:cs="Times New Roman"/>
+                <w:b/>
+                <w:color w:val="000000" w:themeColor="text1"/>
+                <w:sz w:val="18"/>
+                <w:szCs w:val="24"/>
+              </w:rPr>
+              <w:t>Scenario</w:t>
+            </w:r>
+          </w:p>
+        </w:tc>
+        <w:tc>
+          <w:tcPr>
+            <w:tcW w:w="2610" w:type="dxa"/>
+            <w:shd w:val="clear" w:color="auto" w:fill="D9EAF7"/>
+          </w:tcPr>
+          <w:p>
+            <w:pPr>
+              <w:rPr>
+                <w:rFonts w:ascii="Times New Roman" w:hAnsi="Times New Roman" w:cs="Times New Roman"/>
+                <w:color w:val="000000" w:themeColor="text1"/>
+                <w:sz w:val="18"/>
+                <w:szCs w:val="24"/>
+              </w:rPr>
+            </w:pPr>
+            <w:r>
+              <w:rPr>
+                <w:rFonts w:ascii="Times New Roman" w:hAnsi="Times New Roman" w:cs="Times New Roman"/>
+                <w:b/>
+                <w:color w:val="000000" w:themeColor="text1"/>
+                <w:sz w:val="18"/>
+                <w:szCs w:val="24"/>
+              </w:rPr>
+              <w:t>What changes</w:t>
+            </w:r>
+          </w:p>
+        </w:tc>
+        <w:tc>
+          <w:tcPr>
+            <w:tcW w:w="2700" w:type="dxa"/>
+            <w:shd w:val="clear" w:color="auto" w:fill="D9EAF7"/>
+          </w:tcPr>
+          <w:p>
+            <w:pPr>
+              <w:rPr>
+                <w:rFonts w:ascii="Times New Roman" w:hAnsi="Times New Roman" w:cs="Times New Roman"/>
+                <w:color w:val="000000" w:themeColor="text1"/>
+                <w:sz w:val="18"/>
+                <w:szCs w:val="24"/>
+              </w:rPr>
+            </w:pPr>
+            <w:r>
+              <w:rPr>
+                <w:rFonts w:ascii="Times New Roman" w:hAnsi="Times New Roman" w:cs="Times New Roman"/>
+                <w:b/>
+                <w:color w:val="000000" w:themeColor="text1"/>
+                <w:sz w:val="18"/>
+                <w:szCs w:val="24"/>
+              </w:rPr>
+              <w:t>Magnitude / assumption</w:t>
+            </w:r>
+          </w:p>
+        </w:tc>
+        <w:tc>
+          <w:tcPr>
+            <w:tcW w:w="2520" w:type="dxa"/>
+            <w:shd w:val="clear" w:color="auto" w:fill="D9EAF7"/>
+          </w:tcPr>
+          <w:p>
+            <w:pPr>
+              <w:rPr>
+                <w:rFonts w:ascii="Times New Roman" w:hAnsi="Times New Roman" w:cs="Times New Roman"/>
+                <w:color w:val="000000" w:themeColor="text1"/>
+                <w:sz w:val="18"/>
+                <w:szCs w:val="24"/>
+              </w:rPr>
+            </w:pPr>
+            <w:r>
+              <w:rPr>
+                <w:rFonts w:ascii="Times New Roman" w:hAnsi="Times New Roman" w:cs="Times New Roman"/>
+                <w:b/>
+                <w:color w:val="000000" w:themeColor="text1"/>
+                <w:sz w:val="18"/>
+                <w:szCs w:val="24"/>
+              </w:rPr>
+              <w:t>Interpretation</w:t>
+            </w:r>
+          </w:p>
+        </w:tc>
+      </w:tr>
+      <w:tr>
+        <w:trPr>
+          <w:jc w:val="center"/>
+        </w:trPr>
+        <w:tc>
+          <w:tcPr>
+            <w:tcW w:w="2250" w:type="dxa"/>
+          </w:tcPr>
+          <w:p>
+            <w:pPr>
+              <w:rPr>
+                <w:rFonts w:ascii="Times New Roman" w:hAnsi="Times New Roman" w:cs="Times New Roman"/>
+                <w:color w:val="000000" w:themeColor="text1"/>
+                <w:sz w:val="18"/>
+                <w:szCs w:val="24"/>
+              </w:rPr>
+            </w:pPr>
+            <w:r>
+              <w:rPr>
+                <w:rFonts w:ascii="Times New Roman" w:hAnsi="Times New Roman" w:cs="Times New Roman"/>
+                <w:color w:val="000000" w:themeColor="text1"/>
+                <w:sz w:val="18"/>
+                <w:szCs w:val="24"/>
+              </w:rPr>
+              <w:t>Baseline decline</w:t>
+            </w:r>
+          </w:p>
+        </w:tc>
+        <w:tc>
+          <w:tcPr>
+            <w:tcW w:w="2610" w:type="dxa"/>
+          </w:tcPr>
+          <w:p>
+            <w:pPr>
+              <w:rPr>
+                <w:rFonts w:ascii="Times New Roman" w:hAnsi="Times New Roman" w:cs="Times New Roman"/>
+                <w:color w:val="000000" w:themeColor="text1"/>
+                <w:sz w:val="18"/>
+                <w:szCs w:val="24"/>
+              </w:rPr>
+            </w:pPr>
+            <w:r>
+              <w:rPr>
+                <w:rFonts w:ascii="Times New Roman" w:hAnsi="Times New Roman" w:cs="Times New Roman"/>
+                <w:color w:val="000000" w:themeColor="text1"/>
+                <w:sz w:val="18"/>
+                <w:szCs w:val="24"/>
+              </w:rPr>
+              <w:t>No policy-feature adjustments</w:t>
+            </w:r>
+          </w:p>
+        </w:tc>
+        <w:tc>
+          <w:tcPr>
+            <w:tcW w:w="2700" w:type="dxa"/>
+          </w:tcPr>
+          <w:p>
+            <w:pPr>
+              <w:rPr>
+                <w:rFonts w:ascii="Times New Roman" w:hAnsi="Times New Roman" w:cs="Times New Roman"/>
+                <w:color w:val="000000" w:themeColor="text1"/>
+                <w:sz w:val="18"/>
+                <w:szCs w:val="24"/>
+              </w:rPr>
+            </w:pPr>
+            <w:r>
+              <w:rPr>
+                <w:rFonts w:ascii="Times New Roman" w:hAnsi="Times New Roman" w:cs="Times New Roman"/>
+                <w:color w:val="000000" w:themeColor="text1"/>
+                <w:sz w:val="18"/>
+                <w:szCs w:val="24"/>
+              </w:rPr>
+              <w:t>Reference path</w:t>
+            </w:r>
+          </w:p>
+        </w:tc>
+        <w:tc>
+          <w:tcPr>
+            <w:tcW w:w="2520" w:type="dxa"/>
+          </w:tcPr>
+          <w:p>
+            <w:pPr>
+              <w:rPr>
+                <w:rFonts w:ascii="Times New Roman" w:hAnsi="Times New Roman" w:cs="Times New Roman"/>
+                <w:color w:val="000000" w:themeColor="text1"/>
+                <w:sz w:val="18"/>
+                <w:szCs w:val="24"/>
+              </w:rPr>
+            </w:pPr>
+            <w:r>
+              <w:rPr>
+                <w:rFonts w:ascii="Times New Roman" w:hAnsi="Times New Roman" w:cs="Times New Roman"/>
+                <w:color w:val="000000" w:themeColor="text1"/>
+                <w:sz w:val="18"/>
+                <w:szCs w:val="24"/>
+              </w:rPr>
+              <w:t>Continues the stylized decline path</w:t>
+            </w:r>
+          </w:p>
+        </w:tc>
+      </w:tr>
+      <w:tr>
+        <w:trPr>
+          <w:jc w:val="center"/>
+        </w:trPr>
+        <w:tc>
+          <w:tcPr>
+            <w:tcW w:w="2250" w:type="dxa"/>
+          </w:tcPr>
+          <w:p>
+            <w:pPr>
+              <w:rPr>
+                <w:rFonts w:ascii="Times New Roman" w:hAnsi="Times New Roman" w:cs="Times New Roman"/>
+                <w:color w:val="000000" w:themeColor="text1"/>
+                <w:sz w:val="18"/>
+                <w:szCs w:val="24"/>
+              </w:rPr>
+            </w:pPr>
+            <w:r>
+              <w:rPr>
+                <w:rFonts w:ascii="Times New Roman" w:hAnsi="Times New Roman" w:cs="Times New Roman"/>
+                <w:color w:val="000000" w:themeColor="text1"/>
+                <w:sz w:val="18"/>
+                <w:szCs w:val="24"/>
+              </w:rPr>
+              <w:t>Retention bundle</w:t>
+            </w:r>
+          </w:p>
+        </w:tc>
+        <w:tc>
+          <w:tcPr>
+            <w:tcW w:w="2610" w:type="dxa"/>
+          </w:tcPr>
+          <w:p>
+            <w:pPr>
+              <w:rPr>
+                <w:rFonts w:ascii="Times New Roman" w:hAnsi="Times New Roman" w:cs="Times New Roman"/>
+                <w:color w:val="000000" w:themeColor="text1"/>
+                <w:sz w:val="18"/>
+                <w:szCs w:val="24"/>
+              </w:rPr>
+            </w:pPr>
+            <w:r>
+              <w:rPr>
+                <w:rFonts w:ascii="Times New Roman" w:hAnsi="Times New Roman" w:cs="Times New Roman"/>
+                <w:color w:val="000000" w:themeColor="text1"/>
+                <w:sz w:val="18"/>
+                <w:szCs w:val="24"/>
+              </w:rPr>
+              <w:t>Jobs + safety + vulnerability + demographic-support features</w:t>
+            </w:r>
+          </w:p>
+        </w:tc>
+        <w:tc>
+          <w:tcPr>
+            <w:tcW w:w="2700" w:type="dxa"/>
+          </w:tcPr>
+          <w:p>
+            <w:pPr>
+              <w:rPr>
+                <w:rFonts w:ascii="Times New Roman" w:hAnsi="Times New Roman" w:cs="Times New Roman"/>
+                <w:color w:val="000000" w:themeColor="text1"/>
+                <w:sz w:val="18"/>
+                <w:szCs w:val="24"/>
+              </w:rPr>
+            </w:pPr>
+            <w:r>
+              <w:rPr>
+                <w:rFonts w:ascii="Times New Roman" w:hAnsi="Times New Roman" w:cs="Times New Roman"/>
+                <w:color w:val="000000" w:themeColor="text1"/>
+                <w:sz w:val="18"/>
+                <w:szCs w:val="24"/>
+              </w:rPr>
+              <w:t>20% jobs/safety; 15% vulnerability; natural-change and population-momentum support</w:t>
+            </w:r>
+          </w:p>
+        </w:tc>
+        <w:tc>
+          <w:tcPr>
+            <w:tcW w:w="2520" w:type="dxa"/>
+          </w:tcPr>
+          <w:p>
+            <w:pPr>
+              <w:rPr>
+                <w:rFonts w:ascii="Times New Roman" w:hAnsi="Times New Roman" w:cs="Times New Roman"/>
+                <w:color w:val="000000" w:themeColor="text1"/>
+                <w:sz w:val="18"/>
+                <w:szCs w:val="24"/>
+              </w:rPr>
+            </w:pPr>
+            <w:r>
+              <w:rPr>
+                <w:rFonts w:ascii="Times New Roman" w:hAnsi="Times New Roman" w:cs="Times New Roman"/>
+                <w:color w:val="000000" w:themeColor="text1"/>
+                <w:sz w:val="18"/>
+                <w:szCs w:val="24"/>
+              </w:rPr>
+              <w:t>Standard coordinated package; slows decline but does not reverse momentum</w:t>
+            </w:r>
+          </w:p>
+        </w:tc>
+      </w:tr>
+      <w:tr>
+        <w:trPr>
+          <w:jc w:val="center"/>
+        </w:trPr>
+        <w:tc>
+          <w:tcPr>
+            <w:tcW w:w="2250" w:type="dxa"/>
+          </w:tcPr>
+          <w:p>
+            <w:pPr>
+              <w:rPr>
+                <w:rFonts w:ascii="Times New Roman" w:hAnsi="Times New Roman" w:cs="Times New Roman"/>
+                <w:color w:val="000000" w:themeColor="text1"/>
+                <w:sz w:val="18"/>
+                <w:szCs w:val="24"/>
+              </w:rPr>
+            </w:pPr>
+            <w:r>
+              <w:rPr>
+                <w:rFonts w:ascii="Times New Roman" w:hAnsi="Times New Roman" w:cs="Times New Roman"/>
+                <w:color w:val="000000" w:themeColor="text1"/>
+                <w:sz w:val="18"/>
+                <w:szCs w:val="24"/>
+              </w:rPr>
+              <w:t>Recovery bundle / recovery strategy</w:t>
+            </w:r>
+          </w:p>
+        </w:tc>
+        <w:tc>
+          <w:tcPr>
+            <w:tcW w:w="2610" w:type="dxa"/>
+          </w:tcPr>
+          <w:p>
+            <w:pPr>
+              <w:rPr>
+                <w:rFonts w:ascii="Times New Roman" w:hAnsi="Times New Roman" w:cs="Times New Roman"/>
+                <w:color w:val="000000" w:themeColor="text1"/>
+                <w:sz w:val="18"/>
+                <w:szCs w:val="24"/>
+              </w:rPr>
+            </w:pPr>
+            <w:r>
+              <w:rPr>
+                <w:rFonts w:ascii="Times New Roman" w:hAnsi="Times New Roman" w:cs="Times New Roman"/>
+                <w:color w:val="000000" w:themeColor="text1"/>
+                <w:sz w:val="18"/>
+                <w:szCs w:val="24"/>
+              </w:rPr>
+              <w:t>Stronger version of the retention bundle passed through the model</w:t>
+            </w:r>
+          </w:p>
+        </w:tc>
+        <w:tc>
+          <w:tcPr>
+            <w:tcW w:w="2700" w:type="dxa"/>
+          </w:tcPr>
+          <w:p>
+            <w:pPr>
+              <w:rPr>
+                <w:rFonts w:ascii="Times New Roman" w:hAnsi="Times New Roman" w:cs="Times New Roman"/>
+                <w:color w:val="000000" w:themeColor="text1"/>
+                <w:sz w:val="18"/>
+                <w:szCs w:val="24"/>
+              </w:rPr>
+            </w:pPr>
+            <w:r>
+              <w:rPr>
+                <w:rFonts w:ascii="Times New Roman" w:hAnsi="Times New Roman" w:cs="Times New Roman"/>
+                <w:color w:val="000000" w:themeColor="text1"/>
+                <w:sz w:val="18"/>
+                <w:szCs w:val="24"/>
+              </w:rPr>
+              <w:t>Larger feature improvements across jobs, safety, vulnerability, natural change, and momentum proxies</w:t>
+            </w:r>
+          </w:p>
+        </w:tc>
+        <w:tc>
+          <w:tcPr>
+            <w:tcW w:w="2520" w:type="dxa"/>
+          </w:tcPr>
+          <w:p>
+            <w:pPr>
+              <w:rPr>
+                <w:rFonts w:ascii="Times New Roman" w:hAnsi="Times New Roman" w:cs="Times New Roman"/>
+                <w:color w:val="000000" w:themeColor="text1"/>
+                <w:sz w:val="18"/>
+                <w:szCs w:val="24"/>
+              </w:rPr>
+            </w:pPr>
+            <w:r>
+              <w:rPr>
+                <w:rFonts w:ascii="Times New Roman" w:hAnsi="Times New Roman" w:cs="Times New Roman"/>
+                <w:color w:val="000000" w:themeColor="text1"/>
+                <w:sz w:val="18"/>
+                <w:szCs w:val="24"/>
+              </w:rPr>
+              <w:t>Model-implied recovery improves the trajectory but may still decline</w:t>
+            </w:r>
+          </w:p>
+        </w:tc>
+      </w:tr>
+      <w:tr>
+        <w:trPr>
+          <w:jc w:val="center"/>
+        </w:trPr>
+        <w:tc>
+          <w:tcPr>
+            <w:tcW w:w="2250" w:type="dxa"/>
+          </w:tcPr>
+          <w:p>
+            <w:pPr>
+              <w:rPr>
+                <w:rFonts w:ascii="Times New Roman" w:hAnsi="Times New Roman" w:cs="Times New Roman"/>
+                <w:color w:val="000000" w:themeColor="text1"/>
+                <w:sz w:val="18"/>
+                <w:szCs w:val="24"/>
+              </w:rPr>
+            </w:pPr>
+            <w:r>
+              <w:rPr>
+                <w:rFonts w:ascii="Times New Roman" w:hAnsi="Times New Roman" w:cs="Times New Roman"/>
+                <w:color w:val="000000" w:themeColor="text1"/>
+                <w:sz w:val="18"/>
+                <w:szCs w:val="24"/>
+              </w:rPr>
+              <w:t>Recovery rebound + return migration</w:t>
+            </w:r>
+          </w:p>
+        </w:tc>
+        <w:tc>
+          <w:tcPr>
+            <w:tcW w:w="2610" w:type="dxa"/>
+          </w:tcPr>
+          <w:p>
+            <w:pPr>
+              <w:rPr>
+                <w:rFonts w:ascii="Times New Roman" w:hAnsi="Times New Roman" w:cs="Times New Roman"/>
+                <w:color w:val="000000" w:themeColor="text1"/>
+                <w:sz w:val="18"/>
+                <w:szCs w:val="24"/>
+              </w:rPr>
+            </w:pPr>
+            <w:r>
+              <w:rPr>
+                <w:rFonts w:ascii="Times New Roman" w:hAnsi="Times New Roman" w:cs="Times New Roman"/>
+                <w:color w:val="000000" w:themeColor="text1"/>
+                <w:sz w:val="18"/>
+                <w:szCs w:val="24"/>
+              </w:rPr>
+              <w:t>Recovery bundle plus explicit rebound layer</w:t>
+            </w:r>
+          </w:p>
+        </w:tc>
+        <w:tc>
+          <w:tcPr>
+            <w:tcW w:w="2700" w:type="dxa"/>
+          </w:tcPr>
+          <w:p>
+            <w:pPr>
+              <w:rPr>
+                <w:rFonts w:ascii="Times New Roman" w:hAnsi="Times New Roman" w:cs="Times New Roman"/>
+                <w:color w:val="000000" w:themeColor="text1"/>
+                <w:sz w:val="18"/>
+                <w:szCs w:val="24"/>
+              </w:rPr>
+            </w:pPr>
+            <w:r>
+              <w:rPr>
+                <w:rFonts w:ascii="Times New Roman" w:hAnsi="Times New Roman" w:cs="Times New Roman"/>
+                <w:color w:val="000000" w:themeColor="text1"/>
+                <w:sz w:val="18"/>
+                <w:szCs w:val="24"/>
+              </w:rPr>
+              <w:t>Adds temporary recovery momentum and a 2030 floor above the latest observed level</w:t>
+            </w:r>
+          </w:p>
+        </w:tc>
+        <w:tc>
+          <w:tcPr>
+            <w:tcW w:w="2520" w:type="dxa"/>
+          </w:tcPr>
+          <w:p>
+            <w:pPr>
+              <w:rPr>
+                <w:rFonts w:ascii="Times New Roman" w:hAnsi="Times New Roman" w:cs="Times New Roman"/>
+                <w:color w:val="000000" w:themeColor="text1"/>
+                <w:sz w:val="18"/>
+                <w:szCs w:val="24"/>
+              </w:rPr>
+            </w:pPr>
+            <w:r>
+              <w:rPr>
+                <w:rFonts w:ascii="Times New Roman" w:hAnsi="Times New Roman" w:cs="Times New Roman"/>
+                <w:color w:val="000000" w:themeColor="text1"/>
+                <w:sz w:val="18"/>
+                <w:szCs w:val="24"/>
+              </w:rPr>
+              <w:t>Sensitivity case showing what may be required for stabilization or growth</w:t>
+            </w:r>
+          </w:p>
+        </w:tc>
+      </w:tr>
+    </w:tbl>
+    <w:p>
+      <w:pPr>
+        <w:jc w:val="center"/>
+        <w:rPr>
+          <w:rFonts w:ascii="Times New Roman" w:hAnsi="Times New Roman" w:cs="Times New Roman"/>
+          <w:color w:val="000000" w:themeColor="text1"/>
+        </w:rPr>
+      </w:pPr>
+      <w:r>
+        <w:rPr>
+          <w:rFonts w:ascii="Times New Roman" w:hAnsi="Times New Roman" w:cs="Times New Roman"/>
+          <w:b/>
+          <w:i/>
+          <w:color w:val="000000" w:themeColor="text1"/>
+        </w:rPr>
+        <w:t xml:space="preserve">Appendix Table A2. </w:t>
+      </w:r>
+      <w:r>
+        <w:rPr>
+          <w:rFonts w:ascii="Times New Roman" w:hAnsi="Times New Roman" w:cs="Times New Roman"/>
+          <w:i/>
+          <w:color w:val="000000" w:themeColor="text1"/>
+        </w:rPr>
+        <w:t>Policy scenario definitions and interpretation. This table helps readers distinguish model-implied policy effects from the stronger recovery-rebound sensitivity case.</w:t>
+      </w:r>
+    </w:p>
+    <w:p>
+      <w:pPr>
+        <w:pStyle w:val="ListBullet"/>
+        <w:numPr>
+          <w:ilvl w:val="0"/>
+          <w:numId w:val="0"/>
+        </w:numPr>
+        <w:spacing w:after="60"/>
+        <w:rPr>
+          <w:rFonts w:ascii="Times New Roman" w:hAnsi="Times New Roman" w:cs="Times New Roman"/>
+          <w:b/>
+          <w:bCs/>
+          <w:color w:val="000000" w:themeColor="text1"/>
+          <w:sz w:val="22"/>
+        </w:rPr>
+      </w:pPr>
+    </w:p>
+    <w:p>
+      <w:pPr>
+        <w:pStyle w:val="ListBullet"/>
+        <w:numPr>
+          <w:ilvl w:val="0"/>
+          <w:numId w:val="0"/>
+        </w:numPr>
+        <w:spacing w:after="60"/>
+        <w:rPr>
+          <w:rFonts w:ascii="Times New Roman" w:hAnsi="Times New Roman" w:cs="Times New Roman"/>
+          <w:b/>
+          <w:bCs/>
+          <w:color w:val="000000" w:themeColor="text1"/>
+          <w:sz w:val="22"/>
+        </w:rPr>
+      </w:pPr>
+    </w:p>
+    <w:p>
+      <w:pPr>
+        <w:pStyle w:val="ListBullet"/>
+        <w:numPr>
+          <w:ilvl w:val="0"/>
+          <w:numId w:val="0"/>
+        </w:numPr>
+        <w:spacing w:after="60"/>
+        <w:rPr>
+          <w:rFonts w:ascii="Times New Roman" w:hAnsi="Times New Roman" w:cs="Times New Roman"/>
+          <w:b/>
+          <w:bCs/>
+          <w:color w:val="000000" w:themeColor="text1"/>
+          <w:sz w:val="22"/>
+        </w:rPr>
+      </w:pPr>
+    </w:p>
+    <w:p>
+      <w:pPr>
+        <w:pStyle w:val="ListBullet"/>
+        <w:numPr>
+          <w:ilvl w:val="0"/>
+          <w:numId w:val="0"/>
+        </w:numPr>
+        <w:spacing w:after="60"/>
+        <w:rPr>
+          <w:rFonts w:ascii="Times New Roman" w:hAnsi="Times New Roman" w:cs="Times New Roman"/>
+          <w:b/>
+          <w:bCs/>
+          <w:color w:val="000000" w:themeColor="text1"/>
+          <w:sz w:val="22"/>
+        </w:rPr>
+      </w:pPr>
+    </w:p>
+    <w:p>
+      <w:pPr>
+        <w:pStyle w:val="ListBullet"/>
+        <w:numPr>
+          <w:ilvl w:val="0"/>
+          <w:numId w:val="0"/>
+        </w:numPr>
+        <w:spacing w:after="60"/>
+        <w:rPr>
+          <w:rFonts w:ascii="Times New Roman" w:hAnsi="Times New Roman" w:cs="Times New Roman"/>
+          <w:b/>
+          <w:bCs/>
+          <w:color w:val="000000" w:themeColor="text1"/>
+          <w:sz w:val="22"/>
+        </w:rPr>
+      </w:pPr>
+    </w:p>
+    <w:p>
+      <w:pPr>
+        <w:pStyle w:val="ListBullet"/>
+        <w:numPr>
+          <w:ilvl w:val="0"/>
+          <w:numId w:val="0"/>
+        </w:numPr>
+        <w:spacing w:after="60"/>
+        <w:rPr>
+          <w:rFonts w:ascii="Times New Roman" w:hAnsi="Times New Roman" w:cs="Times New Roman"/>
+          <w:b/>
+          <w:bCs/>
+          <w:color w:val="000000" w:themeColor="text1"/>
+          <w:sz w:val="22"/>
+        </w:rPr>
+      </w:pPr>
+    </w:p>
+    <w:p>
+      <w:pPr>
+        <w:pStyle w:val="Heading1"/>
+        <w:rPr>
+          <w:rFonts w:ascii="Times New Roman" w:hAnsi="Times New Roman" w:cs="Times New Roman"/>
+          <w:color w:val="000000" w:themeColor="text1"/>
+          <w:sz w:val="28"/>
+          <w:szCs w:val="24"/>
+        </w:rPr>
+      </w:pPr>
+      <w:r>
+        <w:rPr>
+          <w:rFonts w:ascii="Times New Roman" w:hAnsi="Times New Roman" w:cs="Times New Roman"/>
+          <w:color w:val="000000" w:themeColor="text1"/>
+          <w:sz w:val="28"/>
+          <w:szCs w:val="24"/>
+        </w:rPr>
+        <w:lastRenderedPageBreak/>
+        <w:t>A5. Recovery-Rebound Sensitivity and Endpoint Uncertainty</w:t>
+      </w:r>
+    </w:p>
+    <w:p>
+      <w:pPr>
+        <w:jc w:val="center"/>
+        <w:rPr>
+          <w:rFonts w:ascii="Times New Roman" w:hAnsi="Times New Roman" w:cs="Times New Roman"/>
+          <w:color w:val="000000" w:themeColor="text1"/>
+        </w:rPr>
+      </w:pPr>
+      <w:r>
+        <w:rPr>
+          <w:rFonts w:ascii="Times New Roman" w:hAnsi="Times New Roman" w:cs="Times New Roman"/>
+          <w:noProof/>
+          <w:color w:val="000000" w:themeColor="text1"/>
+        </w:rPr>
+        <w:drawing>
+          <wp:inline distT="0" distB="0" distL="0" distR="0" wp14:anchorId="4FD4F6FC" wp14:editId="7EA5A050">
+            <wp:extent cx="6035040" cy="4475392"/>
+            <wp:effectExtent l="0" t="0" r="0" b="0"/>
+            <wp:docPr id="5" name="Picture 5" descr="A graph and chart with colorful lines&#10;&#10;AI-generated content may be incorrect."/>
+            <wp:cNvGraphicFramePr>
+              <a:graphicFrameLocks xmlns:a="http://schemas.openxmlformats.org/drawingml/2006/main" noChangeAspect="1"/>
+            </wp:cNvGraphicFramePr>
+            <a:graphic xmlns:a="http://schemas.openxmlformats.org/drawingml/2006/main">
+              <a:graphicData uri="http://schemas.openxmlformats.org/drawingml/2006/picture">
+                <pic:pic xmlns:pic="http://schemas.openxmlformats.org/drawingml/2006/picture">
+                  <pic:nvPicPr>
+                    <pic:cNvPr id="5" name="Picture 5" descr="A graph and chart with colorful lines&#10;&#10;AI-generated content may be incorrect."/>
+                    <pic:cNvPicPr/>
+                  </pic:nvPicPr>
+                  <pic:blipFill>
+                    <a:blip r:embed="rId23"/>
+                    <a:stretch>
+                      <a:fillRect/>
+                    </a:stretch>
+                  </pic:blipFill>
+                  <pic:spPr>
+                    <a:xfrm>
+                      <a:off x="0" y="0"/>
+                      <a:ext cx="6035040" cy="4475392"/>
+                    </a:xfrm>
+                    <a:prstGeom prst="rect">
+                      <a:avLst/>
+                    </a:prstGeom>
+                  </pic:spPr>
+                </pic:pic>
+              </a:graphicData>
+            </a:graphic>
+          </wp:inline>
+        </w:drawing>
+      </w:r>
+    </w:p>
+    <w:p>
+      <w:pPr>
+        <w:jc w:val="center"/>
+        <w:rPr>
+          <w:rFonts w:ascii="Times New Roman" w:hAnsi="Times New Roman" w:cs="Times New Roman"/>
+          <w:color w:val="000000" w:themeColor="text1"/>
+        </w:rPr>
+      </w:pPr>
+      <w:r>
+        <w:rPr>
+          <w:rFonts w:ascii="Times New Roman" w:hAnsi="Times New Roman" w:cs="Times New Roman"/>
+          <w:b/>
+          <w:i/>
+          <w:color w:val="000000" w:themeColor="text1"/>
+        </w:rPr>
+        <w:t xml:space="preserve">Appendix Figure A5. </w:t>
+      </w:r>
+      <w:r>
+        <w:rPr>
+          <w:rFonts w:ascii="Times New Roman" w:hAnsi="Times New Roman" w:cs="Times New Roman"/>
+          <w:i/>
+          <w:color w:val="000000" w:themeColor="text1"/>
+        </w:rPr>
+        <w:t>Islandwide recovery scenarios and 2030 endpoint comparison. The rebound sensitivity shows the additional recovery momentum needed to stabilize or temporarily increase population, while the error bars indicate endpoint uncertainty.</w:t>
+      </w:r>
+    </w:p>
+    <w:tbl>
+      <w:tblPr>
+        <w:tblStyle w:val="TableGrid"/>
+        <w:tblW w:w="0" w:type="auto"/>
+        <w:jc w:val="center"/>
+        <w:tblLook w:val="04A0" w:firstRow="1" w:lastRow="0" w:firstColumn="1" w:lastColumn="0" w:noHBand="0" w:noVBand="1"/>
+      </w:tblPr>
+      <w:tblGrid>
+        <w:gridCol w:w="1800"/>
+        <w:gridCol w:w="1530"/>
+        <w:gridCol w:w="1890"/>
+        <w:gridCol w:w="2250"/>
+        <w:gridCol w:w="2610"/>
+      </w:tblGrid>
+      <w:tr>
+        <w:trPr>
+          <w:jc w:val="center"/>
+        </w:trPr>
+        <w:tc>
+          <w:tcPr>
+            <w:tcW w:w="1800" w:type="dxa"/>
+            <w:shd w:val="clear" w:color="auto" w:fill="D9EAF7"/>
+          </w:tcPr>
+          <w:p>
+            <w:pPr>
+              <w:rPr>
+                <w:rFonts w:ascii="Times New Roman" w:hAnsi="Times New Roman" w:cs="Times New Roman"/>
+                <w:color w:val="000000" w:themeColor="text1"/>
+                <w:sz w:val="21"/>
+                <w:szCs w:val="32"/>
+              </w:rPr>
+            </w:pPr>
+            <w:r>
+              <w:rPr>
+                <w:rFonts w:ascii="Times New Roman" w:hAnsi="Times New Roman" w:cs="Times New Roman"/>
+                <w:b/>
+                <w:color w:val="000000" w:themeColor="text1"/>
+                <w:sz w:val="21"/>
+                <w:szCs w:val="32"/>
+              </w:rPr>
+              <w:t>Scenario</w:t>
+            </w:r>
+          </w:p>
+        </w:tc>
+        <w:tc>
+          <w:tcPr>
+            <w:tcW w:w="1530" w:type="dxa"/>
+            <w:shd w:val="clear" w:color="auto" w:fill="D9EAF7"/>
+          </w:tcPr>
+          <w:p>
+            <w:pPr>
+              <w:rPr>
+                <w:rFonts w:ascii="Times New Roman" w:hAnsi="Times New Roman" w:cs="Times New Roman"/>
+                <w:color w:val="000000" w:themeColor="text1"/>
+                <w:sz w:val="21"/>
+                <w:szCs w:val="32"/>
+              </w:rPr>
+            </w:pPr>
+            <w:r>
+              <w:rPr>
+                <w:rFonts w:ascii="Times New Roman" w:hAnsi="Times New Roman" w:cs="Times New Roman"/>
+                <w:b/>
+                <w:color w:val="000000" w:themeColor="text1"/>
+                <w:sz w:val="21"/>
+                <w:szCs w:val="32"/>
+              </w:rPr>
+              <w:t>2030 endpoint</w:t>
+            </w:r>
+          </w:p>
+        </w:tc>
+        <w:tc>
+          <w:tcPr>
+            <w:tcW w:w="1890" w:type="dxa"/>
+            <w:shd w:val="clear" w:color="auto" w:fill="D9EAF7"/>
+          </w:tcPr>
+          <w:p>
+            <w:pPr>
+              <w:rPr>
+                <w:rFonts w:ascii="Times New Roman" w:hAnsi="Times New Roman" w:cs="Times New Roman"/>
+                <w:color w:val="000000" w:themeColor="text1"/>
+                <w:sz w:val="21"/>
+                <w:szCs w:val="32"/>
+              </w:rPr>
+            </w:pPr>
+            <w:r>
+              <w:rPr>
+                <w:rFonts w:ascii="Times New Roman" w:hAnsi="Times New Roman" w:cs="Times New Roman"/>
+                <w:b/>
+                <w:color w:val="000000" w:themeColor="text1"/>
+                <w:sz w:val="21"/>
+                <w:szCs w:val="32"/>
+              </w:rPr>
+              <w:t>Difference vs baseline</w:t>
+            </w:r>
+          </w:p>
+        </w:tc>
+        <w:tc>
+          <w:tcPr>
+            <w:tcW w:w="2250" w:type="dxa"/>
+            <w:shd w:val="clear" w:color="auto" w:fill="D9EAF7"/>
+          </w:tcPr>
+          <w:p>
+            <w:pPr>
+              <w:rPr>
+                <w:rFonts w:ascii="Times New Roman" w:hAnsi="Times New Roman" w:cs="Times New Roman"/>
+                <w:color w:val="000000" w:themeColor="text1"/>
+                <w:sz w:val="21"/>
+                <w:szCs w:val="32"/>
+              </w:rPr>
+            </w:pPr>
+            <w:r>
+              <w:rPr>
+                <w:rFonts w:ascii="Times New Roman" w:hAnsi="Times New Roman" w:cs="Times New Roman"/>
+                <w:b/>
+                <w:color w:val="000000" w:themeColor="text1"/>
+                <w:sz w:val="21"/>
+                <w:szCs w:val="32"/>
+              </w:rPr>
+              <w:t>Endpoint uncertainty</w:t>
+            </w:r>
+          </w:p>
+        </w:tc>
+        <w:tc>
+          <w:tcPr>
+            <w:tcW w:w="2610" w:type="dxa"/>
+            <w:shd w:val="clear" w:color="auto" w:fill="D9EAF7"/>
+          </w:tcPr>
+          <w:p>
+            <w:pPr>
+              <w:rPr>
+                <w:rFonts w:ascii="Times New Roman" w:hAnsi="Times New Roman" w:cs="Times New Roman"/>
+                <w:color w:val="000000" w:themeColor="text1"/>
+                <w:sz w:val="21"/>
+                <w:szCs w:val="32"/>
+              </w:rPr>
+            </w:pPr>
+            <w:r>
+              <w:rPr>
+                <w:rFonts w:ascii="Times New Roman" w:hAnsi="Times New Roman" w:cs="Times New Roman"/>
+                <w:b/>
+                <w:color w:val="000000" w:themeColor="text1"/>
+                <w:sz w:val="21"/>
+                <w:szCs w:val="32"/>
+              </w:rPr>
+              <w:t>Difference vs latest observed</w:t>
+            </w:r>
+          </w:p>
+        </w:tc>
+      </w:tr>
+      <w:tr>
+        <w:trPr>
+          <w:jc w:val="center"/>
+        </w:trPr>
+        <w:tc>
+          <w:tcPr>
+            <w:tcW w:w="1800" w:type="dxa"/>
+          </w:tcPr>
+          <w:p>
+            <w:pPr>
+              <w:rPr>
+                <w:rFonts w:ascii="Times New Roman" w:hAnsi="Times New Roman" w:cs="Times New Roman"/>
+                <w:color w:val="000000" w:themeColor="text1"/>
+                <w:sz w:val="21"/>
+                <w:szCs w:val="32"/>
+              </w:rPr>
+            </w:pPr>
+            <w:r>
+              <w:rPr>
+                <w:rFonts w:ascii="Times New Roman" w:hAnsi="Times New Roman" w:cs="Times New Roman"/>
+                <w:color w:val="000000" w:themeColor="text1"/>
+                <w:sz w:val="21"/>
+                <w:szCs w:val="32"/>
+              </w:rPr>
+              <w:t>Baseline decline</w:t>
+            </w:r>
+          </w:p>
+        </w:tc>
+        <w:tc>
+          <w:tcPr>
+            <w:tcW w:w="1530" w:type="dxa"/>
+          </w:tcPr>
+          <w:p>
+            <w:pPr>
+              <w:jc w:val="center"/>
+              <w:rPr>
+                <w:rFonts w:ascii="Times New Roman" w:hAnsi="Times New Roman" w:cs="Times New Roman"/>
+                <w:color w:val="000000" w:themeColor="text1"/>
+                <w:sz w:val="21"/>
+                <w:szCs w:val="32"/>
+              </w:rPr>
+            </w:pPr>
+            <w:r>
+              <w:rPr>
+                <w:rFonts w:ascii="Times New Roman" w:hAnsi="Times New Roman" w:cs="Times New Roman"/>
+                <w:color w:val="000000" w:themeColor="text1"/>
+                <w:sz w:val="21"/>
+                <w:szCs w:val="32"/>
+              </w:rPr>
+              <w:t>3,008,314</w:t>
+            </w:r>
+          </w:p>
+        </w:tc>
+        <w:tc>
+          <w:tcPr>
+            <w:tcW w:w="1890" w:type="dxa"/>
+          </w:tcPr>
+          <w:p>
+            <w:pPr>
+              <w:jc w:val="center"/>
+              <w:rPr>
+                <w:rFonts w:ascii="Times New Roman" w:hAnsi="Times New Roman" w:cs="Times New Roman"/>
+                <w:color w:val="000000" w:themeColor="text1"/>
+                <w:sz w:val="21"/>
+                <w:szCs w:val="32"/>
+              </w:rPr>
+            </w:pPr>
+            <w:r>
+              <w:rPr>
+                <w:rFonts w:ascii="Times New Roman" w:hAnsi="Times New Roman" w:cs="Times New Roman"/>
+                <w:color w:val="000000" w:themeColor="text1"/>
+                <w:sz w:val="21"/>
+                <w:szCs w:val="32"/>
+              </w:rPr>
+              <w:t>-</w:t>
+            </w:r>
+          </w:p>
+        </w:tc>
+        <w:tc>
+          <w:tcPr>
+            <w:tcW w:w="2250" w:type="dxa"/>
+          </w:tcPr>
+          <w:p>
+            <w:pPr>
+              <w:jc w:val="center"/>
+              <w:rPr>
+                <w:rFonts w:ascii="Times New Roman" w:hAnsi="Times New Roman" w:cs="Times New Roman"/>
+                <w:color w:val="000000" w:themeColor="text1"/>
+                <w:sz w:val="21"/>
+                <w:szCs w:val="32"/>
+              </w:rPr>
+            </w:pPr>
+            <w:r>
+              <w:rPr>
+                <w:rFonts w:ascii="Times New Roman" w:hAnsi="Times New Roman" w:cs="Times New Roman"/>
+                <w:color w:val="000000" w:themeColor="text1"/>
+                <w:sz w:val="21"/>
+                <w:szCs w:val="32"/>
+              </w:rPr>
+              <w:t>+/-24,067</w:t>
+            </w:r>
+          </w:p>
+        </w:tc>
+        <w:tc>
+          <w:tcPr>
+            <w:tcW w:w="2610" w:type="dxa"/>
+          </w:tcPr>
+          <w:p>
+            <w:pPr>
+              <w:rPr>
+                <w:rFonts w:ascii="Times New Roman" w:hAnsi="Times New Roman" w:cs="Times New Roman"/>
+                <w:color w:val="000000" w:themeColor="text1"/>
+                <w:sz w:val="21"/>
+                <w:szCs w:val="32"/>
+              </w:rPr>
+            </w:pPr>
+            <w:r>
+              <w:rPr>
+                <w:rFonts w:ascii="Times New Roman" w:hAnsi="Times New Roman" w:cs="Times New Roman"/>
+                <w:color w:val="000000" w:themeColor="text1"/>
+                <w:sz w:val="21"/>
+                <w:szCs w:val="32"/>
+              </w:rPr>
+              <w:t>-225,995 vs latest observed</w:t>
+            </w:r>
+          </w:p>
+        </w:tc>
+      </w:tr>
+      <w:tr>
+        <w:trPr>
+          <w:jc w:val="center"/>
+        </w:trPr>
+        <w:tc>
+          <w:tcPr>
+            <w:tcW w:w="1800" w:type="dxa"/>
+          </w:tcPr>
+          <w:p>
+            <w:pPr>
+              <w:rPr>
+                <w:rFonts w:ascii="Times New Roman" w:hAnsi="Times New Roman" w:cs="Times New Roman"/>
+                <w:color w:val="000000" w:themeColor="text1"/>
+                <w:sz w:val="21"/>
+                <w:szCs w:val="32"/>
+              </w:rPr>
+            </w:pPr>
+            <w:r>
+              <w:rPr>
+                <w:rFonts w:ascii="Times New Roman" w:hAnsi="Times New Roman" w:cs="Times New Roman"/>
+                <w:color w:val="000000" w:themeColor="text1"/>
+                <w:sz w:val="21"/>
+                <w:szCs w:val="32"/>
+              </w:rPr>
+              <w:t>Retention bundle</w:t>
+            </w:r>
+          </w:p>
+        </w:tc>
+        <w:tc>
+          <w:tcPr>
+            <w:tcW w:w="1530" w:type="dxa"/>
+          </w:tcPr>
+          <w:p>
+            <w:pPr>
+              <w:jc w:val="center"/>
+              <w:rPr>
+                <w:rFonts w:ascii="Times New Roman" w:hAnsi="Times New Roman" w:cs="Times New Roman"/>
+                <w:color w:val="000000" w:themeColor="text1"/>
+                <w:sz w:val="21"/>
+                <w:szCs w:val="32"/>
+              </w:rPr>
+            </w:pPr>
+            <w:r>
+              <w:rPr>
+                <w:rFonts w:ascii="Times New Roman" w:hAnsi="Times New Roman" w:cs="Times New Roman"/>
+                <w:color w:val="000000" w:themeColor="text1"/>
+                <w:sz w:val="21"/>
+                <w:szCs w:val="32"/>
+              </w:rPr>
+              <w:t>3,020,731</w:t>
+            </w:r>
+          </w:p>
+        </w:tc>
+        <w:tc>
+          <w:tcPr>
+            <w:tcW w:w="1890" w:type="dxa"/>
+          </w:tcPr>
+          <w:p>
+            <w:pPr>
+              <w:jc w:val="center"/>
+              <w:rPr>
+                <w:rFonts w:ascii="Times New Roman" w:hAnsi="Times New Roman" w:cs="Times New Roman"/>
+                <w:color w:val="000000" w:themeColor="text1"/>
+                <w:sz w:val="21"/>
+                <w:szCs w:val="32"/>
+              </w:rPr>
+            </w:pPr>
+            <w:r>
+              <w:rPr>
+                <w:rFonts w:ascii="Times New Roman" w:hAnsi="Times New Roman" w:cs="Times New Roman"/>
+                <w:color w:val="000000" w:themeColor="text1"/>
+                <w:sz w:val="21"/>
+                <w:szCs w:val="32"/>
+              </w:rPr>
+              <w:t>+12,417</w:t>
+            </w:r>
+          </w:p>
+        </w:tc>
+        <w:tc>
+          <w:tcPr>
+            <w:tcW w:w="2250" w:type="dxa"/>
+          </w:tcPr>
+          <w:p>
+            <w:pPr>
+              <w:jc w:val="center"/>
+              <w:rPr>
+                <w:rFonts w:ascii="Times New Roman" w:hAnsi="Times New Roman" w:cs="Times New Roman"/>
+                <w:color w:val="000000" w:themeColor="text1"/>
+                <w:sz w:val="21"/>
+                <w:szCs w:val="32"/>
+              </w:rPr>
+            </w:pPr>
+            <w:r>
+              <w:rPr>
+                <w:rFonts w:ascii="Times New Roman" w:hAnsi="Times New Roman" w:cs="Times New Roman"/>
+                <w:color w:val="000000" w:themeColor="text1"/>
+                <w:sz w:val="21"/>
+                <w:szCs w:val="32"/>
+              </w:rPr>
+              <w:t>+/-27,187</w:t>
+            </w:r>
+          </w:p>
+        </w:tc>
+        <w:tc>
+          <w:tcPr>
+            <w:tcW w:w="2610" w:type="dxa"/>
+          </w:tcPr>
+          <w:p>
+            <w:pPr>
+              <w:rPr>
+                <w:rFonts w:ascii="Times New Roman" w:hAnsi="Times New Roman" w:cs="Times New Roman"/>
+                <w:color w:val="000000" w:themeColor="text1"/>
+                <w:sz w:val="21"/>
+                <w:szCs w:val="32"/>
+              </w:rPr>
+            </w:pPr>
+            <w:r>
+              <w:rPr>
+                <w:rFonts w:ascii="Times New Roman" w:hAnsi="Times New Roman" w:cs="Times New Roman"/>
+                <w:color w:val="000000" w:themeColor="text1"/>
+                <w:sz w:val="21"/>
+                <w:szCs w:val="32"/>
+              </w:rPr>
+              <w:t>-213,578 vs latest observed</w:t>
+            </w:r>
+          </w:p>
+        </w:tc>
+      </w:tr>
+      <w:tr>
+        <w:trPr>
+          <w:jc w:val="center"/>
+        </w:trPr>
+        <w:tc>
+          <w:tcPr>
+            <w:tcW w:w="1800" w:type="dxa"/>
+          </w:tcPr>
+          <w:p>
+            <w:pPr>
+              <w:rPr>
+                <w:rFonts w:ascii="Times New Roman" w:hAnsi="Times New Roman" w:cs="Times New Roman"/>
+                <w:color w:val="000000" w:themeColor="text1"/>
+                <w:sz w:val="21"/>
+                <w:szCs w:val="32"/>
+              </w:rPr>
+            </w:pPr>
+            <w:r>
+              <w:rPr>
+                <w:rFonts w:ascii="Times New Roman" w:hAnsi="Times New Roman" w:cs="Times New Roman"/>
+                <w:color w:val="000000" w:themeColor="text1"/>
+                <w:sz w:val="21"/>
+                <w:szCs w:val="32"/>
+              </w:rPr>
+              <w:t>Recovery strategy</w:t>
+            </w:r>
+          </w:p>
+        </w:tc>
+        <w:tc>
+          <w:tcPr>
+            <w:tcW w:w="1530" w:type="dxa"/>
+          </w:tcPr>
+          <w:p>
+            <w:pPr>
+              <w:jc w:val="center"/>
+              <w:rPr>
+                <w:rFonts w:ascii="Times New Roman" w:hAnsi="Times New Roman" w:cs="Times New Roman"/>
+                <w:color w:val="000000" w:themeColor="text1"/>
+                <w:sz w:val="21"/>
+                <w:szCs w:val="32"/>
+              </w:rPr>
+            </w:pPr>
+            <w:r>
+              <w:rPr>
+                <w:rFonts w:ascii="Times New Roman" w:hAnsi="Times New Roman" w:cs="Times New Roman"/>
+                <w:color w:val="000000" w:themeColor="text1"/>
+                <w:sz w:val="21"/>
+                <w:szCs w:val="32"/>
+              </w:rPr>
+              <w:t>3,040,666</w:t>
+            </w:r>
+          </w:p>
+        </w:tc>
+        <w:tc>
+          <w:tcPr>
+            <w:tcW w:w="1890" w:type="dxa"/>
+          </w:tcPr>
+          <w:p>
+            <w:pPr>
+              <w:jc w:val="center"/>
+              <w:rPr>
+                <w:rFonts w:ascii="Times New Roman" w:hAnsi="Times New Roman" w:cs="Times New Roman"/>
+                <w:color w:val="000000" w:themeColor="text1"/>
+                <w:sz w:val="21"/>
+                <w:szCs w:val="32"/>
+              </w:rPr>
+            </w:pPr>
+            <w:r>
+              <w:rPr>
+                <w:rFonts w:ascii="Times New Roman" w:hAnsi="Times New Roman" w:cs="Times New Roman"/>
+                <w:color w:val="000000" w:themeColor="text1"/>
+                <w:sz w:val="21"/>
+                <w:szCs w:val="32"/>
+              </w:rPr>
+              <w:t>+32,352</w:t>
+            </w:r>
+          </w:p>
+        </w:tc>
+        <w:tc>
+          <w:tcPr>
+            <w:tcW w:w="2250" w:type="dxa"/>
+          </w:tcPr>
+          <w:p>
+            <w:pPr>
+              <w:jc w:val="center"/>
+              <w:rPr>
+                <w:rFonts w:ascii="Times New Roman" w:hAnsi="Times New Roman" w:cs="Times New Roman"/>
+                <w:color w:val="000000" w:themeColor="text1"/>
+                <w:sz w:val="21"/>
+                <w:szCs w:val="32"/>
+              </w:rPr>
+            </w:pPr>
+            <w:r>
+              <w:rPr>
+                <w:rFonts w:ascii="Times New Roman" w:hAnsi="Times New Roman" w:cs="Times New Roman"/>
+                <w:color w:val="000000" w:themeColor="text1"/>
+                <w:sz w:val="21"/>
+                <w:szCs w:val="32"/>
+              </w:rPr>
+              <w:t>+/-30,407</w:t>
+            </w:r>
+          </w:p>
+        </w:tc>
+        <w:tc>
+          <w:tcPr>
+            <w:tcW w:w="2610" w:type="dxa"/>
+          </w:tcPr>
+          <w:p>
+            <w:pPr>
+              <w:rPr>
+                <w:rFonts w:ascii="Times New Roman" w:hAnsi="Times New Roman" w:cs="Times New Roman"/>
+                <w:color w:val="000000" w:themeColor="text1"/>
+                <w:sz w:val="21"/>
+                <w:szCs w:val="32"/>
+              </w:rPr>
+            </w:pPr>
+            <w:r>
+              <w:rPr>
+                <w:rFonts w:ascii="Times New Roman" w:hAnsi="Times New Roman" w:cs="Times New Roman"/>
+                <w:color w:val="000000" w:themeColor="text1"/>
+                <w:sz w:val="21"/>
+                <w:szCs w:val="32"/>
+              </w:rPr>
+              <w:t>-193,643 vs latest observed</w:t>
+            </w:r>
+          </w:p>
+        </w:tc>
+      </w:tr>
+      <w:tr>
+        <w:trPr>
+          <w:jc w:val="center"/>
+        </w:trPr>
+        <w:tc>
+          <w:tcPr>
+            <w:tcW w:w="1800" w:type="dxa"/>
+          </w:tcPr>
+          <w:p>
+            <w:pPr>
+              <w:rPr>
+                <w:rFonts w:ascii="Times New Roman" w:hAnsi="Times New Roman" w:cs="Times New Roman"/>
+                <w:color w:val="000000" w:themeColor="text1"/>
+                <w:sz w:val="21"/>
+                <w:szCs w:val="32"/>
+              </w:rPr>
+            </w:pPr>
+            <w:r>
+              <w:rPr>
+                <w:rFonts w:ascii="Times New Roman" w:hAnsi="Times New Roman" w:cs="Times New Roman"/>
+                <w:color w:val="000000" w:themeColor="text1"/>
+                <w:sz w:val="21"/>
+                <w:szCs w:val="32"/>
+              </w:rPr>
+              <w:t>Recovery rebound sensitivity</w:t>
+            </w:r>
+          </w:p>
+        </w:tc>
+        <w:tc>
+          <w:tcPr>
+            <w:tcW w:w="1530" w:type="dxa"/>
+          </w:tcPr>
+          <w:p>
+            <w:pPr>
+              <w:jc w:val="center"/>
+              <w:rPr>
+                <w:rFonts w:ascii="Times New Roman" w:hAnsi="Times New Roman" w:cs="Times New Roman"/>
+                <w:color w:val="000000" w:themeColor="text1"/>
+                <w:sz w:val="21"/>
+                <w:szCs w:val="32"/>
+              </w:rPr>
+            </w:pPr>
+            <w:r>
+              <w:rPr>
+                <w:rFonts w:ascii="Times New Roman" w:hAnsi="Times New Roman" w:cs="Times New Roman"/>
+                <w:color w:val="000000" w:themeColor="text1"/>
+                <w:sz w:val="21"/>
+                <w:szCs w:val="32"/>
+              </w:rPr>
+              <w:t>3,253,715</w:t>
+            </w:r>
+          </w:p>
+        </w:tc>
+        <w:tc>
+          <w:tcPr>
+            <w:tcW w:w="1890" w:type="dxa"/>
+          </w:tcPr>
+          <w:p>
+            <w:pPr>
+              <w:jc w:val="center"/>
+              <w:rPr>
+                <w:rFonts w:ascii="Times New Roman" w:hAnsi="Times New Roman" w:cs="Times New Roman"/>
+                <w:color w:val="000000" w:themeColor="text1"/>
+                <w:sz w:val="21"/>
+                <w:szCs w:val="32"/>
+              </w:rPr>
+            </w:pPr>
+            <w:r>
+              <w:rPr>
+                <w:rFonts w:ascii="Times New Roman" w:hAnsi="Times New Roman" w:cs="Times New Roman"/>
+                <w:color w:val="000000" w:themeColor="text1"/>
+                <w:sz w:val="21"/>
+                <w:szCs w:val="32"/>
+              </w:rPr>
+              <w:t>+245,401</w:t>
+            </w:r>
+          </w:p>
+        </w:tc>
+        <w:tc>
+          <w:tcPr>
+            <w:tcW w:w="2250" w:type="dxa"/>
+          </w:tcPr>
+          <w:p>
+            <w:pPr>
+              <w:jc w:val="center"/>
+              <w:rPr>
+                <w:rFonts w:ascii="Times New Roman" w:hAnsi="Times New Roman" w:cs="Times New Roman"/>
+                <w:color w:val="000000" w:themeColor="text1"/>
+                <w:sz w:val="21"/>
+                <w:szCs w:val="32"/>
+              </w:rPr>
+            </w:pPr>
+            <w:r>
+              <w:rPr>
+                <w:rFonts w:ascii="Times New Roman" w:hAnsi="Times New Roman" w:cs="Times New Roman"/>
+                <w:color w:val="000000" w:themeColor="text1"/>
+                <w:sz w:val="21"/>
+                <w:szCs w:val="32"/>
+              </w:rPr>
+              <w:t>+/-26,030</w:t>
+            </w:r>
+          </w:p>
+        </w:tc>
+        <w:tc>
+          <w:tcPr>
+            <w:tcW w:w="2610" w:type="dxa"/>
+          </w:tcPr>
+          <w:p>
+            <w:pPr>
+              <w:rPr>
+                <w:rFonts w:ascii="Times New Roman" w:hAnsi="Times New Roman" w:cs="Times New Roman"/>
+                <w:color w:val="000000" w:themeColor="text1"/>
+                <w:sz w:val="21"/>
+                <w:szCs w:val="32"/>
+              </w:rPr>
+            </w:pPr>
+            <w:r>
+              <w:rPr>
+                <w:rFonts w:ascii="Times New Roman" w:hAnsi="Times New Roman" w:cs="Times New Roman"/>
+                <w:color w:val="000000" w:themeColor="text1"/>
+                <w:sz w:val="21"/>
+                <w:szCs w:val="32"/>
+              </w:rPr>
+              <w:t>+19,406 vs latest observed</w:t>
+            </w:r>
+          </w:p>
+        </w:tc>
+      </w:tr>
+    </w:tbl>
+    <w:p>
+      <w:pPr>
+        <w:jc w:val="center"/>
+        <w:rPr>
+          <w:rFonts w:ascii="Times New Roman" w:hAnsi="Times New Roman" w:cs="Times New Roman"/>
+          <w:color w:val="000000" w:themeColor="text1"/>
+        </w:rPr>
+      </w:pPr>
+      <w:r>
+        <w:rPr>
+          <w:rFonts w:ascii="Times New Roman" w:hAnsi="Times New Roman" w:cs="Times New Roman"/>
+          <w:b/>
+          <w:i/>
+          <w:color w:val="000000" w:themeColor="text1"/>
+        </w:rPr>
+        <w:t xml:space="preserve">Appendix Table A3. </w:t>
+      </w:r>
+      <w:r>
+        <w:rPr>
+          <w:rFonts w:ascii="Times New Roman" w:hAnsi="Times New Roman" w:cs="Times New Roman"/>
+          <w:i/>
+          <w:color w:val="000000" w:themeColor="text1"/>
+        </w:rPr>
+        <w:t>2030 policy endpoint estimates and uncertainty ranges. Values are included to support the report discussion that the rebound sensitivity should be interpreted as an estimated range, not an exact population count.</w:t>
+      </w:r>
+    </w:p>
+    <w:p>
+      <w:pPr>
+        <w:rPr>
+          <w:rFonts w:ascii="Times New Roman" w:hAnsi="Times New Roman" w:cs="Times New Roman"/>
+          <w:color w:val="000000" w:themeColor="text1"/>
+        </w:rPr>
+      </w:pPr>
+      <w:r>
+        <w:rPr>
+          <w:rFonts w:ascii="Times New Roman" w:hAnsi="Times New Roman" w:cs="Times New Roman"/>
+          <w:color w:val="000000" w:themeColor="text1"/>
+        </w:rPr>
+        <w:br w:type="page"/>
+      </w:r>
+    </w:p>
+    <w:p>
+      <w:pPr>
+        <w:pStyle w:val="Heading1"/>
+        <w:rPr>
+          <w:rFonts w:ascii="Times New Roman" w:hAnsi="Times New Roman" w:cs="Times New Roman"/>
+          <w:color w:val="000000" w:themeColor="text1"/>
+          <w:sz w:val="28"/>
+          <w:szCs w:val="24"/>
+        </w:rPr>
+      </w:pPr>
+      <w:r>
+        <w:rPr>
+          <w:rFonts w:ascii="Times New Roman" w:hAnsi="Times New Roman" w:cs="Times New Roman"/>
+          <w:color w:val="000000" w:themeColor="text1"/>
+          <w:sz w:val="28"/>
+          <w:szCs w:val="24"/>
+        </w:rPr>
+        <w:lastRenderedPageBreak/>
+        <w:t>A6. Regional Recovery-Rebound Paths</w:t>
+      </w:r>
+    </w:p>
+    <w:p>
+      <w:pPr>
+        <w:jc w:val="center"/>
+        <w:rPr>
+          <w:rFonts w:ascii="Times New Roman" w:hAnsi="Times New Roman" w:cs="Times New Roman"/>
+          <w:color w:val="000000" w:themeColor="text1"/>
+        </w:rPr>
+      </w:pPr>
+      <w:r>
+        <w:rPr>
+          <w:rFonts w:ascii="Times New Roman" w:hAnsi="Times New Roman" w:cs="Times New Roman"/>
+          <w:noProof/>
+          <w:color w:val="000000" w:themeColor="text1"/>
+        </w:rPr>
+        <w:drawing>
+          <wp:inline distT="0" distB="0" distL="0" distR="0" wp14:anchorId="73A81F3A" wp14:editId="330424FC">
+            <wp:extent cx="6035040" cy="3402683"/>
+            <wp:effectExtent l="0" t="0" r="0" b="0"/>
+            <wp:docPr id="6" name="Picture 6" descr="A group of graphs showing different types of data&#10;&#10;AI-generated content may be incorrect."/>
+            <wp:cNvGraphicFramePr>
+              <a:graphicFrameLocks xmlns:a="http://schemas.openxmlformats.org/drawingml/2006/main" noChangeAspect="1"/>
+            </wp:cNvGraphicFramePr>
+            <a:graphic xmlns:a="http://schemas.openxmlformats.org/drawingml/2006/main">
+              <a:graphicData uri="http://schemas.openxmlformats.org/drawingml/2006/picture">
+                <pic:pic xmlns:pic="http://schemas.openxmlformats.org/drawingml/2006/picture">
+                  <pic:nvPicPr>
+                    <pic:cNvPr id="6" name="Picture 6" descr="A group of graphs showing different types of data&#10;&#10;AI-generated content may be incorrect."/>
+                    <pic:cNvPicPr/>
+                  </pic:nvPicPr>
+                  <pic:blipFill>
+                    <a:blip r:embed="rId26"/>
+                    <a:stretch>
+                      <a:fillRect/>
+                    </a:stretch>
+                  </pic:blipFill>
+                  <pic:spPr>
+                    <a:xfrm>
+                      <a:off x="0" y="0"/>
+                      <a:ext cx="6035040" cy="3402683"/>
+                    </a:xfrm>
+                    <a:prstGeom prst="rect">
+                      <a:avLst/>
+                    </a:prstGeom>
+                  </pic:spPr>
+                </pic:pic>
+              </a:graphicData>
+            </a:graphic>
+          </wp:inline>
+        </w:drawing>
+      </w:r>
+    </w:p>
+    <w:p>
+      <w:pPr>
+        <w:jc w:val="center"/>
+        <w:rPr>
+          <w:rFonts w:ascii="Times New Roman" w:hAnsi="Times New Roman" w:cs="Times New Roman"/>
+          <w:color w:val="000000" w:themeColor="text1"/>
+        </w:rPr>
+      </w:pPr>
+      <w:r>
+        <w:rPr>
+          <w:rFonts w:ascii="Times New Roman" w:hAnsi="Times New Roman" w:cs="Times New Roman"/>
+          <w:b/>
+          <w:i/>
+          <w:color w:val="000000" w:themeColor="text1"/>
+        </w:rPr>
+        <w:t xml:space="preserve">Appendix Figure A6. </w:t>
+      </w:r>
+      <w:r>
+        <w:rPr>
+          <w:rFonts w:ascii="Times New Roman" w:hAnsi="Times New Roman" w:cs="Times New Roman"/>
+          <w:i/>
+          <w:color w:val="000000" w:themeColor="text1"/>
+        </w:rPr>
+        <w:t>Regional recovery-rebound sensitivity paths. The figure shows that stabilization or rebound is not uniform across regions, reinforcing the need for place-sensitive policy interpretation.</w:t>
+      </w:r>
+    </w:p>
+    <w:p>
+      <w:pPr>
+        <w:pStyle w:val="Heading1"/>
+        <w:rPr>
+          <w:rFonts w:ascii="Times New Roman" w:hAnsi="Times New Roman" w:cs="Times New Roman"/>
+          <w:color w:val="000000" w:themeColor="text1"/>
+          <w:sz w:val="28"/>
+          <w:szCs w:val="24"/>
+        </w:rPr>
+      </w:pPr>
+      <w:r>
+        <w:rPr>
+          <w:rFonts w:ascii="Times New Roman" w:hAnsi="Times New Roman" w:cs="Times New Roman"/>
+          <w:color w:val="000000" w:themeColor="text1"/>
+          <w:sz w:val="28"/>
+          <w:szCs w:val="24"/>
+        </w:rPr>
+        <w:t>A7. Regional Policy Effects by Package</w:t>
+      </w:r>
+    </w:p>
+    <w:p>
+      <w:pPr>
+        <w:jc w:val="center"/>
+        <w:rPr>
+          <w:rFonts w:ascii="Times New Roman" w:hAnsi="Times New Roman" w:cs="Times New Roman"/>
+          <w:color w:val="000000" w:themeColor="text1"/>
+        </w:rPr>
+      </w:pPr>
+      <w:r>
+        <w:rPr>
+          <w:rFonts w:ascii="Times New Roman" w:hAnsi="Times New Roman" w:cs="Times New Roman"/>
+          <w:noProof/>
+          <w:color w:val="000000" w:themeColor="text1"/>
+        </w:rPr>
+        <w:drawing>
+          <wp:inline distT="0" distB="0" distL="0" distR="0" wp14:anchorId="3684313C" wp14:editId="410B9E0E">
+            <wp:extent cx="5943600" cy="3215390"/>
+            <wp:effectExtent l="0" t="0" r="0" b="0"/>
+            <wp:docPr id="7" name="Picture 7" descr="A graph of different colored bars&#10;&#10;AI-generated content may be incorrect."/>
+            <wp:cNvGraphicFramePr>
+              <a:graphicFrameLocks xmlns:a="http://schemas.openxmlformats.org/drawingml/2006/main" noChangeAspect="1"/>
+            </wp:cNvGraphicFramePr>
+            <a:graphic xmlns:a="http://schemas.openxmlformats.org/drawingml/2006/main">
+              <a:graphicData uri="http://schemas.openxmlformats.org/drawingml/2006/picture">
+                <pic:pic xmlns:pic="http://schemas.openxmlformats.org/drawingml/2006/picture">
+                  <pic:nvPicPr>
+                    <pic:cNvPr id="7" name="Picture 7" descr="A graph of different colored bars&#10;&#10;AI-generated content may be incorrect."/>
+                    <pic:cNvPicPr/>
+                  </pic:nvPicPr>
+                  <pic:blipFill>
+                    <a:blip r:embed="rId27"/>
+                    <a:stretch>
+                      <a:fillRect/>
+                    </a:stretch>
+                  </pic:blipFill>
+                  <pic:spPr>
+                    <a:xfrm>
+                      <a:off x="0" y="0"/>
+                      <a:ext cx="5943600" cy="3215390"/>
+                    </a:xfrm>
+                    <a:prstGeom prst="rect">
+                      <a:avLst/>
+                    </a:prstGeom>
+                  </pic:spPr>
+                </pic:pic>
+              </a:graphicData>
+            </a:graphic>
+          </wp:inline>
+        </w:drawing>
+      </w:r>
+    </w:p>
+    <w:p>
+      <w:pPr>
+        <w:jc w:val="center"/>
+        <w:rPr>
+          <w:rFonts w:ascii="Times New Roman" w:hAnsi="Times New Roman" w:cs="Times New Roman"/>
+          <w:color w:val="000000" w:themeColor="text1"/>
+        </w:rPr>
+      </w:pPr>
+      <w:r>
+        <w:rPr>
+          <w:rFonts w:ascii="Times New Roman" w:hAnsi="Times New Roman" w:cs="Times New Roman"/>
+          <w:b/>
+          <w:i/>
+          <w:color w:val="000000" w:themeColor="text1"/>
+        </w:rPr>
+        <w:t xml:space="preserve">Appendix Figure A7. </w:t>
+      </w:r>
+      <w:r>
+        <w:rPr>
+          <w:rFonts w:ascii="Times New Roman" w:hAnsi="Times New Roman" w:cs="Times New Roman"/>
+          <w:i/>
+          <w:color w:val="000000" w:themeColor="text1"/>
+        </w:rPr>
+        <w:t>Approximate retained residents versus baseline by region and policy package. The figure shows that coordinated recovery bundles produce larger gains than isolated interventions across regions.</w:t>
+      </w:r>
+    </w:p>
+    <w:p>
+      <w:pPr>
+        <w:rPr>
+          <w:rFonts w:ascii="Times New Roman" w:hAnsi="Times New Roman" w:cs="Times New Roman"/>
+          <w:color w:val="000000" w:themeColor="text1"/>
+        </w:rPr>
+      </w:pPr>
+      <w:r>
+        <w:rPr>
+          <w:rFonts w:ascii="Times New Roman" w:hAnsi="Times New Roman" w:cs="Times New Roman"/>
+          <w:color w:val="000000" w:themeColor="text1"/>
+        </w:rPr>
+        <w:br w:type="page"/>
+      </w:r>
+    </w:p>
+    <w:p>
+      <w:pPr>
+        <w:pStyle w:val="Heading1"/>
+        <w:rPr>
+          <w:rFonts w:ascii="Times New Roman" w:hAnsi="Times New Roman" w:cs="Times New Roman"/>
+          <w:color w:val="000000" w:themeColor="text1"/>
+          <w:sz w:val="28"/>
+          <w:szCs w:val="24"/>
+        </w:rPr>
+      </w:pPr>
+      <w:r>
+        <w:rPr>
+          <w:rFonts w:ascii="Times New Roman" w:hAnsi="Times New Roman" w:cs="Times New Roman"/>
+          <w:color w:val="000000" w:themeColor="text1"/>
+          <w:sz w:val="28"/>
+          <w:szCs w:val="24"/>
+        </w:rPr>
+        <w:lastRenderedPageBreak/>
+        <w:t>A8. Optional Disaster Scenario Supplements</w:t>
+      </w:r>
+    </w:p>
+    <w:p>
+      <w:pPr>
+        <w:rPr>
+          <w:rFonts w:ascii="Times New Roman" w:hAnsi="Times New Roman" w:cs="Times New Roman"/>
+          <w:color w:val="000000" w:themeColor="text1"/>
+        </w:rPr>
+      </w:pPr>
+      <w:r>
+        <w:rPr>
+          <w:rFonts w:ascii="Times New Roman" w:hAnsi="Times New Roman" w:cs="Times New Roman"/>
+          <w:color w:val="000000" w:themeColor="text1"/>
+        </w:rPr>
+        <w:t>If additional scenario visuals are desired, the following two single-panel figures can supplement the main report figures by showing the hurricane and earthquake scenario ladders separately. They are optional because the main report already includes combined scenario figures.</w:t>
+      </w:r>
+    </w:p>
+    <w:p>
+      <w:pPr>
+        <w:jc w:val="center"/>
+        <w:rPr>
+          <w:rFonts w:ascii="Times New Roman" w:hAnsi="Times New Roman" w:cs="Times New Roman"/>
+          <w:color w:val="000000" w:themeColor="text1"/>
+        </w:rPr>
+      </w:pPr>
+      <w:r>
+        <w:rPr>
+          <w:rFonts w:ascii="Times New Roman" w:hAnsi="Times New Roman" w:cs="Times New Roman"/>
+          <w:noProof/>
+          <w:color w:val="000000" w:themeColor="text1"/>
+        </w:rPr>
+        <w:drawing>
+          <wp:inline distT="0" distB="0" distL="0" distR="0" wp14:anchorId="250FB1BA" wp14:editId="75BB5600">
+            <wp:extent cx="5852160" cy="3185353"/>
+            <wp:effectExtent l="0" t="0" r="0" b="0"/>
+            <wp:docPr id="209538805" name="Picture 209538805" descr="A graph with a line and a point&#10;&#10;AI-generated content may be incorrect."/>
+            <wp:cNvGraphicFramePr>
+              <a:graphicFrameLocks xmlns:a="http://schemas.openxmlformats.org/drawingml/2006/main" noChangeAspect="1"/>
+            </wp:cNvGraphicFramePr>
+            <a:graphic xmlns:a="http://schemas.openxmlformats.org/drawingml/2006/main">
+              <a:graphicData uri="http://schemas.openxmlformats.org/drawingml/2006/picture">
+                <pic:pic xmlns:pic="http://schemas.openxmlformats.org/drawingml/2006/picture">
+                  <pic:nvPicPr>
+                    <pic:cNvPr id="209538805" name="Picture 209538805" descr="A graph with a line and a point&#10;&#10;AI-generated content may be incorrect."/>
+                    <pic:cNvPicPr/>
+                  </pic:nvPicPr>
+                  <pic:blipFill>
+                    <a:blip r:embed="rId10"/>
+                    <a:stretch>
+                      <a:fillRect/>
+                    </a:stretch>
+                  </pic:blipFill>
+                  <pic:spPr>
+                    <a:xfrm>
+                      <a:off x="0" y="0"/>
+                      <a:ext cx="5852160" cy="3185353"/>
+                    </a:xfrm>
+                    <a:prstGeom prst="rect">
+                      <a:avLst/>
+                    </a:prstGeom>
+                  </pic:spPr>
+                </pic:pic>
+              </a:graphicData>
+            </a:graphic>
+          </wp:inline>
+        </w:drawing>
+      </w:r>
+    </w:p>
+    <w:p>
+      <w:pPr>
+        <w:jc w:val="center"/>
+        <w:rPr>
+          <w:rFonts w:ascii="Times New Roman" w:hAnsi="Times New Roman" w:cs="Times New Roman"/>
+          <w:color w:val="000000" w:themeColor="text1"/>
+        </w:rPr>
+      </w:pPr>
+      <w:r>
+        <w:rPr>
+          <w:rFonts w:ascii="Times New Roman" w:hAnsi="Times New Roman" w:cs="Times New Roman"/>
+          <w:b/>
+          <w:i/>
+          <w:color w:val="000000" w:themeColor="text1"/>
+        </w:rPr>
+        <w:t xml:space="preserve">Appendix Figure A8. </w:t>
+      </w:r>
+      <w:r>
+        <w:rPr>
+          <w:rFonts w:ascii="Times New Roman" w:hAnsi="Times New Roman" w:cs="Times New Roman"/>
+          <w:i/>
+          <w:color w:val="000000" w:themeColor="text1"/>
+        </w:rPr>
+        <w:t>Islandwide hurricane scenario ladder through 2030.</w:t>
+      </w:r>
+    </w:p>
+    <w:p>
+      <w:pPr>
+        <w:jc w:val="center"/>
+        <w:rPr>
+          <w:rFonts w:ascii="Times New Roman" w:hAnsi="Times New Roman" w:cs="Times New Roman"/>
+          <w:color w:val="000000" w:themeColor="text1"/>
+        </w:rPr>
+      </w:pPr>
+      <w:r>
+        <w:rPr>
+          <w:rFonts w:ascii="Times New Roman" w:hAnsi="Times New Roman" w:cs="Times New Roman"/>
+          <w:noProof/>
+          <w:color w:val="000000" w:themeColor="text1"/>
+        </w:rPr>
+        <w:drawing>
+          <wp:inline distT="0" distB="0" distL="0" distR="0" wp14:anchorId="3CBC9C9C" wp14:editId="2EDF32D1">
+            <wp:extent cx="5852160" cy="3185353"/>
+            <wp:effectExtent l="0" t="0" r="0" b="0"/>
+            <wp:docPr id="9" name="Picture 9" descr="A graph with a line going up&#10;&#10;AI-generated content may be incorrect."/>
+            <wp:cNvGraphicFramePr>
+              <a:graphicFrameLocks xmlns:a="http://schemas.openxmlformats.org/drawingml/2006/main" noChangeAspect="1"/>
+            </wp:cNvGraphicFramePr>
+            <a:graphic xmlns:a="http://schemas.openxmlformats.org/drawingml/2006/main">
+              <a:graphicData uri="http://schemas.openxmlformats.org/drawingml/2006/picture">
+                <pic:pic xmlns:pic="http://schemas.openxmlformats.org/drawingml/2006/picture">
+                  <pic:nvPicPr>
+                    <pic:cNvPr id="9" name="Picture 9" descr="A graph with a line going up&#10;&#10;AI-generated content may be incorrect."/>
+                    <pic:cNvPicPr/>
+                  </pic:nvPicPr>
+                  <pic:blipFill>
+                    <a:blip r:embed="rId11"/>
+                    <a:stretch>
+                      <a:fillRect/>
+                    </a:stretch>
+                  </pic:blipFill>
+                  <pic:spPr>
+                    <a:xfrm>
+                      <a:off x="0" y="0"/>
+                      <a:ext cx="5852160" cy="3185353"/>
+                    </a:xfrm>
+                    <a:prstGeom prst="rect">
+                      <a:avLst/>
+                    </a:prstGeom>
+                  </pic:spPr>
+                </pic:pic>
+              </a:graphicData>
+            </a:graphic>
+          </wp:inline>
+        </w:drawing>
+      </w:r>
+    </w:p>
+    <w:p>
+      <w:pPr>
+        <w:jc w:val="center"/>
+        <w:rPr>
+          <w:rFonts w:ascii="Times New Roman" w:hAnsi="Times New Roman" w:cs="Times New Roman"/>
+          <w:color w:val="000000" w:themeColor="text1"/>
+        </w:rPr>
+      </w:pPr>
+      <w:r>
+        <w:rPr>
+          <w:rFonts w:ascii="Times New Roman" w:hAnsi="Times New Roman" w:cs="Times New Roman"/>
+          <w:b/>
+          <w:i/>
+          <w:color w:val="000000" w:themeColor="text1"/>
+        </w:rPr>
+        <w:t xml:space="preserve">Appendix Figure A9. </w:t>
+      </w:r>
+      <w:r>
+        <w:rPr>
+          <w:rFonts w:ascii="Times New Roman" w:hAnsi="Times New Roman" w:cs="Times New Roman"/>
+          <w:i/>
+          <w:color w:val="000000" w:themeColor="text1"/>
+        </w:rPr>
+        <w:t>Islandwide earthquake scenario ladder through 2030.</w:t>
+      </w:r>
+    </w:p>
+    <w:p>
+      <w:pPr>
+        <w:pStyle w:val="ListBullet"/>
+        <w:numPr>
+          <w:ilvl w:val="0"/>
+          <w:numId w:val="0"/>
+        </w:numPr>
+        <w:spacing w:after="60"/>
+        <w:rPr>
+          <w:rFonts w:ascii="Times New Roman" w:hAnsi="Times New Roman" w:cs="Times New Roman"/>
+          <w:b/>
+          <w:bCs/>
+          <w:color w:val="000000" w:themeColor="text1"/>
+          <w:sz w:val="22"/>
+        </w:rPr>
+      </w:pPr>
     </w:p>
     <w:sectPr>
-      <w:headerReference w:type="default" r:id="rId24"/>
-      <w:footerReference w:type="default" r:id="rId25"/>
+      <w:headerReference w:type="default" r:id="rId28"/>
+      <w:footerReference w:type="default" r:id="rId29"/>
       <w:pgSz w:w="12240" w:h="15840"/>
       <w:pgMar w:top="936" w:right="1080" w:bottom="936" w:left="1080" w:header="720" w:footer="720" w:gutter="0"/>
       <w:cols w:space="720"/>
@@ -5429,6 +8698,12 @@
     <w:abstractNumId w:val="0"/>
   </w:num>
   <w:num w:numId="10" w16cid:durableId="1527597783">
+    <w:abstractNumId w:val="7"/>
+    <w:lvlOverride w:ilvl="0">
+      <w:startOverride w:val="1"/>
+    </w:lvlOverride>
+  </w:num>
+  <w:num w:numId="11" w16cid:durableId="1699239501">
     <w:abstractNumId w:val="7"/>
     <w:lvlOverride w:ilvl="0">
       <w:startOverride w:val="1"/>

</xml_diff>